<commit_message>
Correcciones de front y back
</commit_message>
<xml_diff>
--- a/Documentacion_Heladeria_Conejito/Guia_Tecnica_Heladeria_Conejito.docx
+++ b/Documentacion_Heladeria_Conejito/Guia_Tecnica_Heladeria_Conejito.docx
@@ -126,35 +126,7 @@
               <w:rPr>
                 <w:color w:val="0066CC"/>
               </w:rPr>
-              <w:t>[</w:t>
-            </w:r>
-            <w:proofErr w:type="spellStart"/>
-            <w:r>
-              <w:rPr>
-                <w:color w:val="0066CC"/>
-              </w:rPr>
-              <w:t>Nombre</w:t>
-            </w:r>
-            <w:proofErr w:type="spellEnd"/>
-            <w:r>
-              <w:rPr>
-                <w:color w:val="0066CC"/>
-              </w:rPr>
-              <w:t xml:space="preserve"> de la </w:t>
-            </w:r>
-            <w:proofErr w:type="spellStart"/>
-            <w:r>
-              <w:rPr>
-                <w:color w:val="0066CC"/>
-              </w:rPr>
-              <w:t>institucion</w:t>
-            </w:r>
-            <w:proofErr w:type="spellEnd"/>
-            <w:r>
-              <w:rPr>
-                <w:color w:val="0066CC"/>
-              </w:rPr>
-              <w:t>]</w:t>
+              <w:t>UNIVERSIDAD TECNOLÓGICA DEL PERÚ</w:t>
             </w:r>
           </w:p>
         </w:tc>
@@ -189,39 +161,17 @@
             <w:tcW w:w="5040" w:type="dxa"/>
           </w:tcPr>
           <w:p>
+            <w:pPr>
+              <w:rPr>
+                <w:lang w:val="es-PE"/>
+              </w:rPr>
+            </w:pPr>
             <w:r>
               <w:rPr>
                 <w:color w:val="0066CC"/>
-              </w:rPr>
-              <w:t>[</w:t>
-            </w:r>
-            <w:proofErr w:type="spellStart"/>
-            <w:r>
-              <w:rPr>
-                <w:color w:val="0066CC"/>
-              </w:rPr>
-              <w:t>Nombre</w:t>
-            </w:r>
-            <w:proofErr w:type="spellEnd"/>
-            <w:r>
-              <w:rPr>
-                <w:color w:val="0066CC"/>
-              </w:rPr>
-              <w:t xml:space="preserve"> del </w:t>
-            </w:r>
-            <w:proofErr w:type="spellStart"/>
-            <w:r>
-              <w:rPr>
-                <w:color w:val="0066CC"/>
-              </w:rPr>
-              <w:t>curso</w:t>
-            </w:r>
-            <w:proofErr w:type="spellEnd"/>
-            <w:r>
-              <w:rPr>
-                <w:color w:val="0066CC"/>
-              </w:rPr>
-              <w:t>]</w:t>
+                <w:lang w:val="es-PE"/>
+              </w:rPr>
+              <w:t>Diseño de productos y servicios</w:t>
             </w:r>
           </w:p>
         </w:tc>
@@ -260,36 +210,30 @@
               <w:rPr>
                 <w:color w:val="0066CC"/>
               </w:rPr>
-              <w:t>[</w:t>
+              <w:t xml:space="preserve">Lino Martin </w:t>
             </w:r>
             <w:proofErr w:type="spellStart"/>
             <w:r>
               <w:rPr>
                 <w:color w:val="0066CC"/>
               </w:rPr>
-              <w:t>Nombre</w:t>
+              <w:t>Quispe</w:t>
             </w:r>
             <w:proofErr w:type="spellEnd"/>
             <w:r>
               <w:rPr>
                 <w:color w:val="0066CC"/>
               </w:rPr>
-              <w:t xml:space="preserve"> del </w:t>
+              <w:t xml:space="preserve"> </w:t>
             </w:r>
             <w:proofErr w:type="spellStart"/>
             <w:r>
               <w:rPr>
                 <w:color w:val="0066CC"/>
               </w:rPr>
-              <w:t>docente</w:t>
+              <w:t>Tincopa</w:t>
             </w:r>
             <w:proofErr w:type="spellEnd"/>
-            <w:r>
-              <w:rPr>
-                <w:color w:val="0066CC"/>
-              </w:rPr>
-              <w:t>]</w:t>
-            </w:r>
           </w:p>
         </w:tc>
       </w:tr>
@@ -323,40 +267,114 @@
             <w:tcW w:w="5040" w:type="dxa"/>
           </w:tcPr>
           <w:p>
-            <w:r>
+            <w:pPr>
               <w:rPr>
                 <w:color w:val="0066CC"/>
-              </w:rPr>
-              <w:t>[</w:t>
+                <w:lang w:val="es-PE"/>
+              </w:rPr>
+            </w:pPr>
+            <w:r>
+              <w:rPr>
+                <w:color w:val="0066CC"/>
+                <w:lang w:val="es-PE"/>
+              </w:rPr>
+              <w:t xml:space="preserve">Cristofer </w:t>
             </w:r>
             <w:proofErr w:type="spellStart"/>
             <w:r>
               <w:rPr>
                 <w:color w:val="0066CC"/>
-              </w:rPr>
-              <w:t>Nombres</w:t>
+                <w:lang w:val="es-PE"/>
+              </w:rPr>
+              <w:t>Benjamin</w:t>
             </w:r>
             <w:proofErr w:type="spellEnd"/>
             <w:r>
               <w:rPr>
                 <w:color w:val="0066CC"/>
-              </w:rPr>
-              <w:t xml:space="preserve"> de los </w:t>
+                <w:lang w:val="es-PE"/>
+              </w:rPr>
+              <w:t xml:space="preserve"> Martinez Camargo</w:t>
+            </w:r>
+          </w:p>
+          <w:p>
+            <w:pPr>
+              <w:rPr>
+                <w:color w:val="0066CC"/>
+                <w:lang w:val="es-PE"/>
+              </w:rPr>
+            </w:pPr>
+            <w:r>
+              <w:rPr>
+                <w:color w:val="0066CC"/>
+                <w:lang w:val="es-PE"/>
+              </w:rPr>
+              <w:t xml:space="preserve">Matheus </w:t>
             </w:r>
             <w:proofErr w:type="spellStart"/>
             <w:r>
               <w:rPr>
                 <w:color w:val="0066CC"/>
-              </w:rPr>
-              <w:t>integrantes</w:t>
+                <w:lang w:val="es-PE"/>
+              </w:rPr>
+              <w:t>Chavez</w:t>
             </w:r>
             <w:proofErr w:type="spellEnd"/>
             <w:r>
               <w:rPr>
                 <w:color w:val="0066CC"/>
-              </w:rPr>
-              <w:t>]</w:t>
-            </w:r>
+                <w:lang w:val="es-PE"/>
+              </w:rPr>
+              <w:t xml:space="preserve"> </w:t>
+            </w:r>
+            <w:proofErr w:type="spellStart"/>
+            <w:r>
+              <w:rPr>
+                <w:color w:val="0066CC"/>
+                <w:lang w:val="es-PE"/>
+              </w:rPr>
+              <w:t>Fernandez</w:t>
+            </w:r>
+            <w:proofErr w:type="spellEnd"/>
+          </w:p>
+          <w:p>
+            <w:pPr>
+              <w:rPr>
+                <w:lang w:val="es-PE"/>
+              </w:rPr>
+            </w:pPr>
+            <w:r>
+              <w:rPr>
+                <w:color w:val="0066CC"/>
+                <w:lang w:val="es-PE"/>
+              </w:rPr>
+              <w:t xml:space="preserve">Huayta </w:t>
+            </w:r>
+            <w:proofErr w:type="spellStart"/>
+            <w:r>
+              <w:rPr>
+                <w:color w:val="0066CC"/>
+                <w:lang w:val="es-PE"/>
+              </w:rPr>
+              <w:t>Cardenas</w:t>
+            </w:r>
+            <w:proofErr w:type="spellEnd"/>
+            <w:r>
+              <w:rPr>
+                <w:color w:val="0066CC"/>
+                <w:lang w:val="es-PE"/>
+              </w:rPr>
+              <w:t xml:space="preserve"> Christian </w:t>
+            </w:r>
+            <w:proofErr w:type="spellStart"/>
+            <w:r>
+              <w:rPr>
+                <w:color w:val="0066CC"/>
+                <w:lang w:val="es-PE"/>
+              </w:rPr>
+              <w:t>Ronaldiñho</w:t>
+            </w:r>
+            <w:proofErr w:type="spellEnd"/>
           </w:p>
         </w:tc>
       </w:tr>
@@ -6505,19 +6523,7 @@
         <w:rPr>
           <w:lang w:val="es-PE"/>
         </w:rPr>
-        <w:t xml:space="preserve">Heladeria Conejito es un sistema web para la gestion de pedidos y </w:t>
-      </w:r>
-      <w:r>
-        <w:rPr>
-          <w:lang w:val="es-PE"/>
-        </w:rPr>
-        <w:t>administracion de una heladeria familiar. Permite a los clientes explorar un menu digital, realizar pedidos en linea, acumular puntos de fidelizacion y gestionar su perfil. El panel administrativo permite gestionar productos, pedidos, clientes, promociones</w:t>
-      </w:r>
-      <w:r>
-        <w:rPr>
-          <w:lang w:val="es-PE"/>
-        </w:rPr>
-        <w:t xml:space="preserve"> y configurar el negocio.</w:t>
+        <w:t>Heladeria Conejito es un sistema web para la gestion de pedidos y administracion de una heladeria familiar. Permite a los clientes explorar un menu digital, realizar pedidos en linea, acumular puntos de fidelizacion y gestionar su perfil. El panel administrativo permite gestionar productos, pedidos, clientes, promociones y configurar el negocio.</w:t>
       </w:r>
     </w:p>
     <w:p>
@@ -6565,15 +6571,7 @@
           <w:color w:val="004C99"/>
           <w:lang w:val="es-PE"/>
         </w:rPr>
-        <w:t>Flujo</w:t>
-      </w:r>
-      <w:r>
-        <w:rPr>
-          <w:rFonts w:ascii="Calibri" w:hAnsi="Calibri"/>
-          <w:color w:val="004C99"/>
-          <w:lang w:val="es-PE"/>
-        </w:rPr>
-        <w:t xml:space="preserve"> de comunicacion</w:t>
+        <w:t>Flujo de comunicacion</w:t>
       </w:r>
       <w:bookmarkEnd w:id="4"/>
     </w:p>
@@ -6765,13 +6763,7 @@
               <w:rPr>
                 <w:sz w:val="18"/>
               </w:rPr>
-              <w:t xml:space="preserve">Biblioteca de </w:t>
-            </w:r>
-            <w:r>
-              <w:rPr>
-                <w:sz w:val="18"/>
-              </w:rPr>
-              <w:t>interfaces</w:t>
+              <w:t>Biblioteca de interfaces</w:t>
             </w:r>
           </w:p>
         </w:tc>
@@ -7885,13 +7877,7 @@
         <w:rPr>
           <w:lang w:val="es-PE"/>
         </w:rPr>
-        <w:t xml:space="preserve">Token JWT </w:t>
-      </w:r>
-      <w:r>
-        <w:rPr>
-          <w:lang w:val="es-PE"/>
-        </w:rPr>
-        <w:t xml:space="preserve">firmado HS384 almacenado en localStorage. </w:t>
+        <w:t xml:space="preserve">Token JWT firmado HS384 almacenado en localStorage. </w:t>
       </w:r>
       <w:r>
         <w:t>Enviado en header Authorization: Bearer &lt;token&gt;.</w:t>
@@ -7956,13 +7942,7 @@
         <w:rPr>
           <w:lang w:val="es-PE"/>
         </w:rPr>
-        <w:t xml:space="preserve">Archivos </w:t>
-      </w:r>
-      <w:r>
-        <w:rPr>
-          <w:lang w:val="es-PE"/>
-        </w:rPr>
-        <w:t>almacenados en upload.dir (default: uploads/). Max 5 MB por archivo, 10 MB por solicitud.</w:t>
+        <w:t>Archivos almacenados en upload.dir (default: uploads/). Max 5 MB por archivo, 10 MB por solicitud.</w:t>
       </w:r>
     </w:p>
     <w:p>
@@ -8048,15 +8028,22 @@
           <w:sz w:val="18"/>
           <w:lang w:val="es-PE"/>
         </w:rPr>
-        <w:t>controller/         20 controladore</w:t>
-      </w:r>
+        <w:t>controller/         20 controladores REST</w:t>
+      </w:r>
+    </w:p>
+    <w:p>
+      <w:pPr>
+        <w:rPr>
+          <w:lang w:val="es-PE"/>
+        </w:rPr>
+      </w:pPr>
       <w:r>
         <w:rPr>
           <w:rFonts w:ascii="Consolas" w:hAnsi="Consolas"/>
           <w:sz w:val="18"/>
           <w:lang w:val="es-PE"/>
         </w:rPr>
-        <w:t>s REST</w:t>
+        <w:t xml:space="preserve">    service/            15 servicios</w:t>
       </w:r>
     </w:p>
     <w:p>
@@ -8071,7 +8058,7 @@
           <w:sz w:val="18"/>
           <w:lang w:val="es-PE"/>
         </w:rPr>
-        <w:t xml:space="preserve">    service/            15 servicios</w:t>
+        <w:t xml:space="preserve">    repository/         18 repositorios JPA</w:t>
       </w:r>
     </w:p>
     <w:p>
@@ -8086,7 +8073,7 @@
           <w:sz w:val="18"/>
           <w:lang w:val="es-PE"/>
         </w:rPr>
-        <w:t xml:space="preserve">    repository/         18 repositorios JPA</w:t>
+        <w:t xml:space="preserve">    model/              19 entidades</w:t>
       </w:r>
     </w:p>
     <w:p>
@@ -8101,7 +8088,7 @@
           <w:sz w:val="18"/>
           <w:lang w:val="es-PE"/>
         </w:rPr>
-        <w:t xml:space="preserve">    model/              19 entidades</w:t>
+        <w:t xml:space="preserve">    dto/                24 DTOs</w:t>
       </w:r>
     </w:p>
     <w:p>
@@ -8116,7 +8103,60 @@
           <w:sz w:val="18"/>
           <w:lang w:val="es-PE"/>
         </w:rPr>
-        <w:t xml:space="preserve">    dto/                24 DTOs</w:t>
+        <w:t xml:space="preserve">    security/           JWT, filtros</w:t>
+      </w:r>
+    </w:p>
+    <w:p>
+      <w:r>
+        <w:rPr>
+          <w:rFonts w:ascii="Consolas" w:hAnsi="Consolas"/>
+          <w:sz w:val="18"/>
+          <w:lang w:val="es-PE"/>
+        </w:rPr>
+        <w:t xml:space="preserve">    </w:t>
+      </w:r>
+      <w:r>
+        <w:rPr>
+          <w:rFonts w:ascii="Consolas" w:hAnsi="Consolas"/>
+          <w:sz w:val="18"/>
+        </w:rPr>
+        <w:t>config/             Seguridad, CORS, WebSocket, DataInitializer</w:t>
+      </w:r>
+    </w:p>
+    <w:p>
+      <w:r>
+        <w:rPr>
+          <w:rFonts w:ascii="Consolas" w:hAnsi="Consolas"/>
+          <w:sz w:val="18"/>
+        </w:rPr>
+        <w:t xml:space="preserve">    exception/          GlobalExceptionHandler</w:t>
+      </w:r>
+    </w:p>
+    <w:p>
+      <w:r>
+        <w:rPr>
+          <w:rFonts w:ascii="Consolas" w:hAnsi="Consolas"/>
+          <w:sz w:val="18"/>
+        </w:rPr>
+        <w:t xml:space="preserve">  src/main/resources/   application.properties (+ perfiles)</w:t>
+      </w:r>
+    </w:p>
+    <w:p>
+      <w:r>
+        <w:rPr>
+          <w:rFonts w:ascii="Consolas" w:hAnsi="Consolas"/>
+          <w:sz w:val="18"/>
+        </w:rPr>
+        <w:t xml:space="preserve">  Dockerfile, pom.xml, mvnw</w:t>
+      </w:r>
+    </w:p>
+    <w:p>
+      <w:r>
+        <w:rPr>
+          <w:rFonts w:ascii="Consolas" w:hAnsi="Consolas"/>
+          <w:sz w:val="18"/>
+        </w:rPr>
+        <w:t>frontend/               React SPA</w:t>
       </w:r>
     </w:p>
     <w:p>
@@ -8129,69 +8169,16 @@
         <w:rPr>
           <w:rFonts w:ascii="Consolas" w:hAnsi="Consolas"/>
           <w:sz w:val="18"/>
-          <w:lang w:val="es-PE"/>
-        </w:rPr>
-        <w:t xml:space="preserve">    security/           JWT, filtros</w:t>
-      </w:r>
-    </w:p>
-    <w:p>
+        </w:rPr>
+        <w:t xml:space="preserve">  </w:t>
+      </w:r>
       <w:r>
         <w:rPr>
           <w:rFonts w:ascii="Consolas" w:hAnsi="Consolas"/>
           <w:sz w:val="18"/>
           <w:lang w:val="es-PE"/>
         </w:rPr>
-        <w:t xml:space="preserve">    </w:t>
-      </w:r>
-      <w:r>
-        <w:rPr>
-          <w:rFonts w:ascii="Consolas" w:hAnsi="Consolas"/>
-          <w:sz w:val="18"/>
-        </w:rPr>
-        <w:t>config/             Seguridad, CORS, WebSocket, DataInitia</w:t>
-      </w:r>
-      <w:r>
-        <w:rPr>
-          <w:rFonts w:ascii="Consolas" w:hAnsi="Consolas"/>
-          <w:sz w:val="18"/>
-        </w:rPr>
-        <w:t>lizer</w:t>
-      </w:r>
-    </w:p>
-    <w:p>
-      <w:r>
-        <w:rPr>
-          <w:rFonts w:ascii="Consolas" w:hAnsi="Consolas"/>
-          <w:sz w:val="18"/>
-        </w:rPr>
-        <w:t xml:space="preserve">    exception/          GlobalExceptionHandler</w:t>
-      </w:r>
-    </w:p>
-    <w:p>
-      <w:r>
-        <w:rPr>
-          <w:rFonts w:ascii="Consolas" w:hAnsi="Consolas"/>
-          <w:sz w:val="18"/>
-        </w:rPr>
-        <w:t xml:space="preserve">  src/main/resources/   application.properties (+ perfiles)</w:t>
-      </w:r>
-    </w:p>
-    <w:p>
-      <w:r>
-        <w:rPr>
-          <w:rFonts w:ascii="Consolas" w:hAnsi="Consolas"/>
-          <w:sz w:val="18"/>
-        </w:rPr>
-        <w:t xml:space="preserve">  Dockerfile, pom.xml, mvnw</w:t>
-      </w:r>
-    </w:p>
-    <w:p>
-      <w:r>
-        <w:rPr>
-          <w:rFonts w:ascii="Consolas" w:hAnsi="Consolas"/>
-          <w:sz w:val="18"/>
-        </w:rPr>
-        <w:t>frontend/               React SPA</w:t>
+        <w:t>src/app/              App.tsx, componentes, ui/</w:t>
       </w:r>
     </w:p>
     <w:p>
@@ -8204,39 +8191,9 @@
         <w:rPr>
           <w:rFonts w:ascii="Consolas" w:hAnsi="Consolas"/>
           <w:sz w:val="18"/>
-        </w:rPr>
-        <w:t xml:space="preserve">  </w:t>
-      </w:r>
-      <w:r>
-        <w:rPr>
-          <w:rFonts w:ascii="Consolas" w:hAnsi="Consolas"/>
-          <w:sz w:val="18"/>
           <w:lang w:val="es-PE"/>
         </w:rPr>
-        <w:t>src/app/              App.tsx, componentes, ui/</w:t>
-      </w:r>
-    </w:p>
-    <w:p>
-      <w:pPr>
-        <w:rPr>
-          <w:lang w:val="es-PE"/>
-        </w:rPr>
-      </w:pPr>
-      <w:r>
-        <w:rPr>
-          <w:rFonts w:ascii="Consolas" w:hAnsi="Consolas"/>
-          <w:sz w:val="18"/>
-          <w:lang w:val="es-PE"/>
-        </w:rPr>
-        <w:t xml:space="preserve">  src/pages/            21 pagi</w:t>
-      </w:r>
-      <w:r>
-        <w:rPr>
-          <w:rFonts w:ascii="Consolas" w:hAnsi="Consolas"/>
-          <w:sz w:val="18"/>
-          <w:lang w:val="es-PE"/>
-        </w:rPr>
-        <w:t>nas</w:t>
+        <w:t xml:space="preserve">  src/pages/            21 paginas</w:t>
       </w:r>
     </w:p>
     <w:p>
@@ -9484,14 +9441,7 @@
           <w:rFonts w:ascii="Consolas" w:hAnsi="Consolas"/>
           <w:sz w:val="18"/>
         </w:rPr>
-        <w:t xml:space="preserve">vercel.json: </w:t>
-      </w:r>
-      <w:r>
-        <w:rPr>
-          <w:rFonts w:ascii="Consolas" w:hAnsi="Consolas"/>
-          <w:sz w:val="18"/>
-        </w:rPr>
-        <w:t>{"rewrites":[{"source":"/(.*)","destination":"/index.html"}]}</w:t>
+        <w:t>vercel.json: {"rewrites":[{"source":"/(.*)","destination":"/index.html"}]}</w:t>
       </w:r>
     </w:p>
     <w:p>
@@ -10015,13 +9965,7 @@
         <w:rPr>
           <w:lang w:val="es-PE"/>
         </w:rPr>
-        <w:t xml:space="preserve">Rutas publicas (GET /productos, /auth/**), rutas ADMIN (POST/PUT/DELETE productos, pedidos), rutas autenticadas (carrito, perfil). CSRF deshabilitado. </w:t>
-      </w:r>
-      <w:r>
-        <w:rPr>
-          <w:lang w:val="es-PE"/>
-        </w:rPr>
-        <w:t>BCryptPasswordEncoder.</w:t>
+        <w:t>Rutas publicas (GET /productos, /auth/**), rutas ADMIN (POST/PUT/DELETE productos, pedidos), rutas autenticadas (carrito, perfil). CSRF deshabilitado. BCryptPasswordEncoder.</w:t>
       </w:r>
     </w:p>
     <w:p>
@@ -10123,10 +10067,7 @@
         <w:t xml:space="preserve">PostgreSQL 16. </w:t>
       </w:r>
       <w:r>
-        <w:t>Alternativa: H</w:t>
-      </w:r>
-      <w:r>
-        <w:t>2 en desarrollo.</w:t>
+        <w:t>Alternativa: H2 en desarrollo.</w:t>
       </w:r>
     </w:p>
     <w:p>
@@ -10372,12 +10313,14 @@
             <w:shd w:val="clear" w:color="auto" w:fill="F2F7FB"/>
           </w:tcPr>
           <w:p>
+            <w:proofErr w:type="spellStart"/>
             <w:r>
               <w:rPr>
                 <w:sz w:val="18"/>
               </w:rPr>
               <w:t>carrito</w:t>
             </w:r>
+            <w:proofErr w:type="spellEnd"/>
           </w:p>
         </w:tc>
         <w:tc>
@@ -10646,13 +10589,7 @@
               <w:rPr>
                 <w:sz w:val="18"/>
               </w:rPr>
-              <w:t xml:space="preserve">Puntos por </w:t>
-            </w:r>
-            <w:r>
-              <w:rPr>
-                <w:sz w:val="18"/>
-              </w:rPr>
-              <w:t>usuario</w:t>
+              <w:t>Puntos por usuario</w:t>
             </w:r>
           </w:p>
         </w:tc>
@@ -12910,13 +12847,7 @@
         <w:rPr>
           <w:lang w:val="es-PE"/>
         </w:rPr>
-        <w:t xml:space="preserve">DataInitializer.java crea el usuario admin (admin@gmail.com / admin123) si no </w:t>
-      </w:r>
-      <w:r>
-        <w:rPr>
-          <w:lang w:val="es-PE"/>
-        </w:rPr>
-        <w:t>existe. El schema.sql contiene datos iniciales: 5 categorias, 2 metodos de entrega, 4 metodos de pago, 4 niveles de fidelizacion, 22 beneficios, 8 promociones y 1 admin.</w:t>
+        <w:t>DataInitializer.java crea el usuario admin (admin@gmail.com / admin123) si no existe. El schema.sql contiene datos iniciales: 5 categorias, 2 metodos de entrega, 4 metodos de pago, 4 niveles de fidelizacion, 22 beneficios, 8 promociones y 1 admin.</w:t>
       </w:r>
     </w:p>
     <w:p>
@@ -18307,11 +18238,33 @@
             <w:tcW w:w="2351" w:type="dxa"/>
           </w:tcPr>
           <w:p>
-            <w:r>
-              <w:rPr>
-                <w:sz w:val="18"/>
-              </w:rPr>
-              <w:t>/api/reportes/ventas?desde=&amp;hasta=</w:t>
+            <w:pPr>
+              <w:rPr>
+                <w:lang w:val="es-PE"/>
+              </w:rPr>
+            </w:pPr>
+            <w:r>
+              <w:rPr>
+                <w:sz w:val="18"/>
+                <w:lang w:val="es-PE"/>
+              </w:rPr>
+              <w:t>/api/reportes/</w:t>
+            </w:r>
+            <w:proofErr w:type="spellStart"/>
+            <w:r>
+              <w:rPr>
+                <w:sz w:val="18"/>
+                <w:lang w:val="es-PE"/>
+              </w:rPr>
+              <w:t>ventas?desde</w:t>
+            </w:r>
+            <w:proofErr w:type="spellEnd"/>
+            <w:r>
+              <w:rPr>
+                <w:sz w:val="18"/>
+                <w:lang w:val="es-PE"/>
+              </w:rPr>
+              <w:t>=&amp;hasta=</w:t>
             </w:r>
           </w:p>
         </w:tc>
@@ -18665,16 +18618,85 @@
       <w:bookmarkEnd w:id="54"/>
     </w:p>
     <w:p>
-      <w:r>
-        <w:t xml:space="preserve">1. Usuario envia </w:t>
-      </w:r>
-      <w:r>
-        <w:t>credenciales a POST /api/auth/login.</w:t>
+      <w:pPr>
+        <w:rPr>
+          <w:lang w:val="es-PE"/>
+        </w:rPr>
+      </w:pPr>
+      <w:r>
+        <w:rPr>
+          <w:lang w:val="es-PE"/>
+        </w:rPr>
+        <w:t xml:space="preserve">1. Usuario </w:t>
+      </w:r>
+      <w:proofErr w:type="spellStart"/>
+      <w:r>
+        <w:rPr>
+          <w:lang w:val="es-PE"/>
+        </w:rPr>
+        <w:t>envia</w:t>
+      </w:r>
+      <w:proofErr w:type="spellEnd"/>
+      <w:r>
+        <w:rPr>
+          <w:lang w:val="es-PE"/>
+        </w:rPr>
+        <w:t xml:space="preserve"> credenciales a POST /api/</w:t>
+      </w:r>
+      <w:proofErr w:type="spellStart"/>
+      <w:r>
+        <w:rPr>
+          <w:lang w:val="es-PE"/>
+        </w:rPr>
+        <w:t>auth</w:t>
+      </w:r>
+      <w:proofErr w:type="spellEnd"/>
+      <w:r>
+        <w:rPr>
+          <w:lang w:val="es-PE"/>
+        </w:rPr>
+        <w:t>/</w:t>
+      </w:r>
+      <w:proofErr w:type="spellStart"/>
+      <w:r>
+        <w:rPr>
+          <w:lang w:val="es-PE"/>
+        </w:rPr>
+        <w:t>login</w:t>
+      </w:r>
+      <w:proofErr w:type="spellEnd"/>
+      <w:r>
+        <w:rPr>
+          <w:lang w:val="es-PE"/>
+        </w:rPr>
+        <w:t>.</w:t>
       </w:r>
     </w:p>
     <w:p>
-      <w:r>
-        <w:t>2. Backend valida y genera JWT.</w:t>
+      <w:pPr>
+        <w:rPr>
+          <w:lang w:val="es-PE"/>
+        </w:rPr>
+      </w:pPr>
+      <w:r>
+        <w:rPr>
+          <w:lang w:val="es-PE"/>
+        </w:rPr>
+        <w:t xml:space="preserve">2. </w:t>
+      </w:r>
+      <w:proofErr w:type="spellStart"/>
+      <w:r>
+        <w:rPr>
+          <w:lang w:val="es-PE"/>
+        </w:rPr>
+        <w:t>Backend</w:t>
+      </w:r>
+      <w:proofErr w:type="spellEnd"/>
+      <w:r>
+        <w:rPr>
+          <w:lang w:val="es-PE"/>
+        </w:rPr>
+        <w:t xml:space="preserve"> valida y genera JWT.</w:t>
       </w:r>
     </w:p>
     <w:p>
@@ -18688,8 +18710,30 @@
       </w:r>
     </w:p>
     <w:p>
-      <w:r>
-        <w:t>5. JwtFilter intercepta, valida y establece contexto de seguridad.</w:t>
+      <w:pPr>
+        <w:rPr>
+          <w:lang w:val="es-PE"/>
+        </w:rPr>
+      </w:pPr>
+      <w:r>
+        <w:rPr>
+          <w:lang w:val="es-PE"/>
+        </w:rPr>
+        <w:t xml:space="preserve">5. </w:t>
+      </w:r>
+      <w:proofErr w:type="spellStart"/>
+      <w:r>
+        <w:rPr>
+          <w:lang w:val="es-PE"/>
+        </w:rPr>
+        <w:t>JwtFilter</w:t>
+      </w:r>
+      <w:proofErr w:type="spellEnd"/>
+      <w:r>
+        <w:rPr>
+          <w:lang w:val="es-PE"/>
+        </w:rPr>
+        <w:t xml:space="preserve"> intercepta, valida y establece contexto de seguridad.</w:t>
       </w:r>
     </w:p>
     <w:p>
@@ -18709,62 +18753,153 @@
     <w:p>
       <w:pPr>
         <w:pStyle w:val="Listaconvietas"/>
+        <w:rPr>
+          <w:lang w:val="es-PE"/>
+        </w:rPr>
       </w:pPr>
       <w:r>
+        <w:rPr>
+          <w:lang w:val="es-PE"/>
+        </w:rPr>
         <w:t>CLIENTE: rol por defecto al registrarse.</w:t>
       </w:r>
     </w:p>
     <w:p>
       <w:pPr>
         <w:pStyle w:val="Listaconvietas"/>
+        <w:rPr>
+          <w:lang w:val="es-PE"/>
+        </w:rPr>
       </w:pPr>
       <w:r>
+        <w:rPr>
+          <w:lang w:val="es-PE"/>
+        </w:rPr>
         <w:t>ADMIN: acceso al panel administrativo.</w:t>
       </w:r>
     </w:p>
     <w:p>
       <w:pPr>
         <w:pStyle w:val="Ttulo2"/>
+        <w:rPr>
+          <w:lang w:val="es-PE"/>
+        </w:rPr>
       </w:pPr>
       <w:bookmarkStart w:id="56" w:name="_Toc234752984"/>
+      <w:proofErr w:type="spellStart"/>
       <w:r>
         <w:rPr>
           <w:rFonts w:ascii="Calibri" w:hAnsi="Calibri"/>
           <w:color w:val="004C99"/>
-        </w:rPr>
-        <w:t>Codificacion de contrasenas</w:t>
+          <w:lang w:val="es-PE"/>
+        </w:rPr>
+        <w:t>Codificacion</w:t>
+      </w:r>
+      <w:proofErr w:type="spellEnd"/>
+      <w:r>
+        <w:rPr>
+          <w:rFonts w:ascii="Calibri" w:hAnsi="Calibri"/>
+          <w:color w:val="004C99"/>
+          <w:lang w:val="es-PE"/>
+        </w:rPr>
+        <w:t xml:space="preserve"> de </w:t>
+      </w:r>
+      <w:proofErr w:type="spellStart"/>
+      <w:r>
+        <w:rPr>
+          <w:rFonts w:ascii="Calibri" w:hAnsi="Calibri"/>
+          <w:color w:val="004C99"/>
+          <w:lang w:val="es-PE"/>
+        </w:rPr>
+        <w:t>contrasenas</w:t>
       </w:r>
       <w:bookmarkEnd w:id="56"/>
+      <w:proofErr w:type="spellEnd"/>
     </w:p>
     <w:p>
-      <w:r>
-        <w:t>BCryptPasswordEncoder con 10 rondas de hash.</w:t>
+      <w:pPr>
+        <w:rPr>
+          <w:lang w:val="es-PE"/>
+        </w:rPr>
+      </w:pPr>
+      <w:proofErr w:type="spellStart"/>
+      <w:r>
+        <w:rPr>
+          <w:lang w:val="es-PE"/>
+        </w:rPr>
+        <w:t>BCryptPasswordEncoder</w:t>
+      </w:r>
+      <w:proofErr w:type="spellEnd"/>
+      <w:r>
+        <w:rPr>
+          <w:lang w:val="es-PE"/>
+        </w:rPr>
+        <w:t xml:space="preserve"> con 10 rondas de hash.</w:t>
       </w:r>
     </w:p>
     <w:p>
       <w:pPr>
         <w:pStyle w:val="Ttulo2"/>
+        <w:rPr>
+          <w:lang w:val="es-PE"/>
+        </w:rPr>
       </w:pPr>
       <w:bookmarkStart w:id="57" w:name="_Toc234752985"/>
       <w:r>
         <w:rPr>
           <w:rFonts w:ascii="Calibri" w:hAnsi="Calibri"/>
           <w:color w:val="004C99"/>
+          <w:lang w:val="es-PE"/>
         </w:rPr>
         <w:t>Manejo de errores</w:t>
       </w:r>
       <w:bookmarkEnd w:id="57"/>
     </w:p>
     <w:p>
-      <w:r>
-        <w:t>GlobalExceptionHandler: 401 (no autenticado), 403 (no autorizado), 404 (no encontrado</w:t>
-      </w:r>
-      <w:r>
-        <w:t>), 400 (validacion), 500 (error interno).</w:t>
+      <w:pPr>
+        <w:rPr>
+          <w:lang w:val="es-PE"/>
+        </w:rPr>
+      </w:pPr>
+      <w:proofErr w:type="spellStart"/>
+      <w:r>
+        <w:rPr>
+          <w:lang w:val="es-PE"/>
+        </w:rPr>
+        <w:t>GlobalExceptionHandler</w:t>
+      </w:r>
+      <w:proofErr w:type="spellEnd"/>
+      <w:r>
+        <w:rPr>
+          <w:lang w:val="es-PE"/>
+        </w:rPr>
+        <w:t>: 401 (no autenticado), 403 (no autorizado), 404 (no encontrado), 400 (</w:t>
+      </w:r>
+      <w:proofErr w:type="spellStart"/>
+      <w:r>
+        <w:rPr>
+          <w:lang w:val="es-PE"/>
+        </w:rPr>
+        <w:t>validacion</w:t>
+      </w:r>
+      <w:proofErr w:type="spellEnd"/>
+      <w:r>
+        <w:rPr>
+          <w:lang w:val="es-PE"/>
+        </w:rPr>
+        <w:t>), 500 (error interno).</w:t>
       </w:r>
     </w:p>
     <w:p>
-      <w:r>
+      <w:pPr>
+        <w:rPr>
+          <w:lang w:val="es-PE"/>
+        </w:rPr>
+      </w:pPr>
+      <w:r>
+        <w:rPr>
+          <w:lang w:val="es-PE"/>
+        </w:rPr>
         <w:br w:type="page"/>
       </w:r>
     </w:p>
@@ -18773,6 +18908,7 @@
         <w:pStyle w:val="Ttulo1"/>
       </w:pPr>
       <w:bookmarkStart w:id="58" w:name="_Toc234752986"/>
+      <w:proofErr w:type="spellStart"/>
       <w:r>
         <w:rPr>
           <w:rFonts w:ascii="Calibri" w:hAnsi="Calibri"/>
@@ -18780,7 +18916,16 @@
           <w:sz w:val="32"/>
         </w:rPr>
         <w:lastRenderedPageBreak/>
-        <w:t>Instalacion local</w:t>
+        <w:t>Instalacion</w:t>
+      </w:r>
+      <w:proofErr w:type="spellEnd"/>
+      <w:r>
+        <w:rPr>
+          <w:rFonts w:ascii="Calibri" w:hAnsi="Calibri"/>
+          <w:color w:val="003366"/>
+          <w:sz w:val="32"/>
+        </w:rPr>
+        <w:t xml:space="preserve"> local</w:t>
       </w:r>
       <w:bookmarkEnd w:id="58"/>
     </w:p>
@@ -18858,29 +19003,154 @@
       <w:bookmarkEnd w:id="62"/>
     </w:p>
     <w:p>
+      <w:pPr>
+        <w:rPr>
+          <w:lang w:val="es-PE"/>
+        </w:rPr>
+      </w:pPr>
+      <w:proofErr w:type="spellStart"/>
       <w:r>
         <w:rPr>
           <w:rFonts w:ascii="Consolas" w:hAnsi="Consolas"/>
           <w:sz w:val="18"/>
-        </w:rPr>
-        <w:t xml:space="preserve">psql -U postgres -c "CREATE DATABASE </w:t>
-      </w:r>
+          <w:lang w:val="es-PE"/>
+        </w:rPr>
+        <w:t>psql</w:t>
+      </w:r>
+      <w:proofErr w:type="spellEnd"/>
       <w:r>
         <w:rPr>
           <w:rFonts w:ascii="Consolas" w:hAnsi="Consolas"/>
           <w:sz w:val="18"/>
-        </w:rPr>
-        <w:t>heladeria_conejito;"</w:t>
+          <w:lang w:val="es-PE"/>
+        </w:rPr>
+        <w:t xml:space="preserve"> -U </w:t>
+      </w:r>
+      <w:proofErr w:type="spellStart"/>
+      <w:r>
+        <w:rPr>
+          <w:rFonts w:ascii="Consolas" w:hAnsi="Consolas"/>
+          <w:sz w:val="18"/>
+          <w:lang w:val="es-PE"/>
+        </w:rPr>
+        <w:t>postgres</w:t>
+      </w:r>
+      <w:proofErr w:type="spellEnd"/>
+      <w:r>
+        <w:rPr>
+          <w:rFonts w:ascii="Consolas" w:hAnsi="Consolas"/>
+          <w:sz w:val="18"/>
+          <w:lang w:val="es-PE"/>
+        </w:rPr>
+        <w:t xml:space="preserve"> -c "CREATE DATABASE </w:t>
+      </w:r>
+      <w:proofErr w:type="spellStart"/>
+      <w:r>
+        <w:rPr>
+          <w:rFonts w:ascii="Consolas" w:hAnsi="Consolas"/>
+          <w:sz w:val="18"/>
+          <w:lang w:val="es-PE"/>
+        </w:rPr>
+        <w:t>heladeria_conejito</w:t>
+      </w:r>
+      <w:proofErr w:type="spellEnd"/>
+      <w:r>
+        <w:rPr>
+          <w:rFonts w:ascii="Consolas" w:hAnsi="Consolas"/>
+          <w:sz w:val="18"/>
+          <w:lang w:val="es-PE"/>
+        </w:rPr>
+        <w:t>;"</w:t>
       </w:r>
     </w:p>
     <w:p>
+      <w:pPr>
+        <w:rPr>
+          <w:lang w:val="es-PE"/>
+        </w:rPr>
+      </w:pPr>
+      <w:proofErr w:type="spellStart"/>
       <w:r>
         <w:rPr>
           <w:rFonts w:ascii="Consolas" w:hAnsi="Consolas"/>
           <w:sz w:val="18"/>
-        </w:rPr>
-        <w:t>psql -U postgres -d heladeria_conejito -f database/schema.sql</w:t>
-      </w:r>
+          <w:lang w:val="es-PE"/>
+        </w:rPr>
+        <w:t>psql</w:t>
+      </w:r>
+      <w:proofErr w:type="spellEnd"/>
+      <w:r>
+        <w:rPr>
+          <w:rFonts w:ascii="Consolas" w:hAnsi="Consolas"/>
+          <w:sz w:val="18"/>
+          <w:lang w:val="es-PE"/>
+        </w:rPr>
+        <w:t xml:space="preserve"> -U </w:t>
+      </w:r>
+      <w:proofErr w:type="spellStart"/>
+      <w:r>
+        <w:rPr>
+          <w:rFonts w:ascii="Consolas" w:hAnsi="Consolas"/>
+          <w:sz w:val="18"/>
+          <w:lang w:val="es-PE"/>
+        </w:rPr>
+        <w:t>postgres</w:t>
+      </w:r>
+      <w:proofErr w:type="spellEnd"/>
+      <w:r>
+        <w:rPr>
+          <w:rFonts w:ascii="Consolas" w:hAnsi="Consolas"/>
+          <w:sz w:val="18"/>
+          <w:lang w:val="es-PE"/>
+        </w:rPr>
+        <w:t xml:space="preserve"> -d </w:t>
+      </w:r>
+      <w:proofErr w:type="spellStart"/>
+      <w:r>
+        <w:rPr>
+          <w:rFonts w:ascii="Consolas" w:hAnsi="Consolas"/>
+          <w:sz w:val="18"/>
+          <w:lang w:val="es-PE"/>
+        </w:rPr>
+        <w:t>heladeria_conejito</w:t>
+      </w:r>
+      <w:proofErr w:type="spellEnd"/>
+      <w:r>
+        <w:rPr>
+          <w:rFonts w:ascii="Consolas" w:hAnsi="Consolas"/>
+          <w:sz w:val="18"/>
+          <w:lang w:val="es-PE"/>
+        </w:rPr>
+        <w:t xml:space="preserve"> -f </w:t>
+      </w:r>
+      <w:proofErr w:type="spellStart"/>
+      <w:r>
+        <w:rPr>
+          <w:rFonts w:ascii="Consolas" w:hAnsi="Consolas"/>
+          <w:sz w:val="18"/>
+          <w:lang w:val="es-PE"/>
+        </w:rPr>
+        <w:t>database</w:t>
+      </w:r>
+      <w:proofErr w:type="spellEnd"/>
+      <w:r>
+        <w:rPr>
+          <w:rFonts w:ascii="Consolas" w:hAnsi="Consolas"/>
+          <w:sz w:val="18"/>
+          <w:lang w:val="es-PE"/>
+        </w:rPr>
+        <w:t>/</w:t>
+      </w:r>
+      <w:proofErr w:type="spellStart"/>
+      <w:r>
+        <w:rPr>
+          <w:rFonts w:ascii="Consolas" w:hAnsi="Consolas"/>
+          <w:sz w:val="18"/>
+          <w:lang w:val="es-PE"/>
+        </w:rPr>
+        <w:t>schema.sql</w:t>
+      </w:r>
+      <w:proofErr w:type="spellEnd"/>
     </w:p>
     <w:p>
       <w:pPr>
@@ -18954,40 +19224,113 @@
     <w:p>
       <w:pPr>
         <w:pStyle w:val="Ttulo1"/>
+        <w:rPr>
+          <w:lang w:val="es-PE"/>
+        </w:rPr>
       </w:pPr>
       <w:bookmarkStart w:id="65" w:name="_Toc234752993"/>
+      <w:proofErr w:type="spellStart"/>
       <w:r>
         <w:rPr>
           <w:rFonts w:ascii="Calibri" w:hAnsi="Calibri"/>
           <w:color w:val="003366"/>
           <w:sz w:val="32"/>
+          <w:lang w:val="es-PE"/>
         </w:rPr>
         <w:lastRenderedPageBreak/>
-        <w:t>Compilacion y pruebas</w:t>
+        <w:t>Compilacion</w:t>
+      </w:r>
+      <w:proofErr w:type="spellEnd"/>
+      <w:r>
+        <w:rPr>
+          <w:rFonts w:ascii="Calibri" w:hAnsi="Calibri"/>
+          <w:color w:val="003366"/>
+          <w:sz w:val="32"/>
+          <w:lang w:val="es-PE"/>
+        </w:rPr>
+        <w:t xml:space="preserve"> y pruebas</w:t>
       </w:r>
       <w:bookmarkEnd w:id="65"/>
     </w:p>
     <w:p>
       <w:pPr>
         <w:pStyle w:val="Ttulo2"/>
+        <w:rPr>
+          <w:lang w:val="es-PE"/>
+        </w:rPr>
       </w:pPr>
       <w:bookmarkStart w:id="66" w:name="_Toc234752994"/>
+      <w:proofErr w:type="spellStart"/>
       <w:r>
         <w:rPr>
           <w:rFonts w:ascii="Calibri" w:hAnsi="Calibri"/>
           <w:color w:val="004C99"/>
+          <w:lang w:val="es-PE"/>
         </w:rPr>
         <w:t>Frontend</w:t>
       </w:r>
       <w:bookmarkEnd w:id="66"/>
+      <w:proofErr w:type="spellEnd"/>
     </w:p>
     <w:p>
+      <w:pPr>
+        <w:rPr>
+          <w:lang w:val="es-PE"/>
+        </w:rPr>
+      </w:pPr>
+      <w:proofErr w:type="spellStart"/>
       <w:r>
         <w:rPr>
           <w:rFonts w:ascii="Consolas" w:hAnsi="Consolas"/>
           <w:sz w:val="18"/>
-        </w:rPr>
-        <w:t>npm run build    # Genera dist/</w:t>
+          <w:lang w:val="es-PE"/>
+        </w:rPr>
+        <w:t>npm</w:t>
+      </w:r>
+      <w:proofErr w:type="spellEnd"/>
+      <w:r>
+        <w:rPr>
+          <w:rFonts w:ascii="Consolas" w:hAnsi="Consolas"/>
+          <w:sz w:val="18"/>
+          <w:lang w:val="es-PE"/>
+        </w:rPr>
+        <w:t xml:space="preserve"> run </w:t>
+      </w:r>
+      <w:proofErr w:type="spellStart"/>
+      <w:r>
+        <w:rPr>
+          <w:rFonts w:ascii="Consolas" w:hAnsi="Consolas"/>
+          <w:sz w:val="18"/>
+          <w:lang w:val="es-PE"/>
+        </w:rPr>
+        <w:t>build</w:t>
+      </w:r>
+      <w:proofErr w:type="spellEnd"/>
+      <w:r>
+        <w:rPr>
+          <w:rFonts w:ascii="Consolas" w:hAnsi="Consolas"/>
+          <w:sz w:val="18"/>
+          <w:lang w:val="es-PE"/>
+        </w:rPr>
+        <w:t xml:space="preserve">    # Genera </w:t>
+      </w:r>
+      <w:proofErr w:type="spellStart"/>
+      <w:r>
+        <w:rPr>
+          <w:rFonts w:ascii="Consolas" w:hAnsi="Consolas"/>
+          <w:sz w:val="18"/>
+          <w:lang w:val="es-PE"/>
+        </w:rPr>
+        <w:t>dist</w:t>
+      </w:r>
+      <w:proofErr w:type="spellEnd"/>
+      <w:r>
+        <w:rPr>
+          <w:rFonts w:ascii="Consolas" w:hAnsi="Consolas"/>
+          <w:sz w:val="18"/>
+          <w:lang w:val="es-PE"/>
+        </w:rPr>
+        <w:t>/</w:t>
       </w:r>
     </w:p>
     <w:p>
@@ -19016,20 +19359,60 @@
     <w:p>
       <w:pPr>
         <w:pStyle w:val="Ttulo2"/>
+        <w:rPr>
+          <w:lang w:val="es-PE"/>
+        </w:rPr>
       </w:pPr>
       <w:bookmarkStart w:id="68" w:name="_Toc234752996"/>
       <w:r>
         <w:rPr>
           <w:rFonts w:ascii="Calibri" w:hAnsi="Calibri"/>
           <w:color w:val="004C99"/>
+          <w:lang w:val="es-PE"/>
         </w:rPr>
         <w:t>Pruebas</w:t>
       </w:r>
       <w:bookmarkEnd w:id="68"/>
     </w:p>
     <w:p>
-      <w:r>
-        <w:t>BackendApplicationTests.java contiene pruebas basicas de contexto Spring Boot.</w:t>
+      <w:pPr>
+        <w:rPr>
+          <w:lang w:val="es-PE"/>
+        </w:rPr>
+      </w:pPr>
+      <w:r>
+        <w:rPr>
+          <w:lang w:val="es-PE"/>
+        </w:rPr>
+        <w:t xml:space="preserve">BackendApplicationTests.java contiene pruebas </w:t>
+      </w:r>
+      <w:proofErr w:type="spellStart"/>
+      <w:r>
+        <w:rPr>
+          <w:lang w:val="es-PE"/>
+        </w:rPr>
+        <w:t>basicas</w:t>
+      </w:r>
+      <w:proofErr w:type="spellEnd"/>
+      <w:r>
+        <w:rPr>
+          <w:lang w:val="es-PE"/>
+        </w:rPr>
+        <w:t xml:space="preserve"> de contexto Spring </w:t>
+      </w:r>
+      <w:proofErr w:type="spellStart"/>
+      <w:r>
+        <w:rPr>
+          <w:lang w:val="es-PE"/>
+        </w:rPr>
+        <w:t>Boot</w:t>
+      </w:r>
+      <w:proofErr w:type="spellEnd"/>
+      <w:r>
+        <w:rPr>
+          <w:lang w:val="es-PE"/>
+        </w:rPr>
+        <w:t>.</w:t>
       </w:r>
     </w:p>
     <w:p>
@@ -19077,33 +19460,183 @@
       <w:bookmarkEnd w:id="70"/>
     </w:p>
     <w:p>
-      <w:r>
-        <w:t xml:space="preserve">Multi-etapa: build con </w:t>
-      </w:r>
-      <w:r>
-        <w:t>maven:3.9-amazoncorretto-21, runtime con amazoncorretto:21-alpine. Expone puerto 8080. Ejecuta java -jar app.jar.</w:t>
+      <w:pPr>
+        <w:rPr>
+          <w:lang w:val="es-PE"/>
+        </w:rPr>
+      </w:pPr>
+      <w:proofErr w:type="spellStart"/>
+      <w:r>
+        <w:rPr>
+          <w:lang w:val="es-PE"/>
+        </w:rPr>
+        <w:t>Multi-etapa</w:t>
+      </w:r>
+      <w:proofErr w:type="spellEnd"/>
+      <w:r>
+        <w:rPr>
+          <w:lang w:val="es-PE"/>
+        </w:rPr>
+        <w:t xml:space="preserve">: </w:t>
+      </w:r>
+      <w:proofErr w:type="spellStart"/>
+      <w:r>
+        <w:rPr>
+          <w:lang w:val="es-PE"/>
+        </w:rPr>
+        <w:t>build</w:t>
+      </w:r>
+      <w:proofErr w:type="spellEnd"/>
+      <w:r>
+        <w:rPr>
+          <w:lang w:val="es-PE"/>
+        </w:rPr>
+        <w:t xml:space="preserve"> con maven:3.9-amazoncorretto-21, </w:t>
+      </w:r>
+      <w:proofErr w:type="spellStart"/>
+      <w:r>
+        <w:rPr>
+          <w:lang w:val="es-PE"/>
+        </w:rPr>
+        <w:t>runtime</w:t>
+      </w:r>
+      <w:proofErr w:type="spellEnd"/>
+      <w:r>
+        <w:rPr>
+          <w:lang w:val="es-PE"/>
+        </w:rPr>
+        <w:t xml:space="preserve"> con amazoncorretto:21-alpine. Expone puerto 8080. Ejecuta java -</w:t>
+      </w:r>
+      <w:proofErr w:type="spellStart"/>
+      <w:r>
+        <w:rPr>
+          <w:lang w:val="es-PE"/>
+        </w:rPr>
+        <w:t>jar</w:t>
+      </w:r>
+      <w:proofErr w:type="spellEnd"/>
+      <w:r>
+        <w:rPr>
+          <w:lang w:val="es-PE"/>
+        </w:rPr>
+        <w:t xml:space="preserve"> app.jar.</w:t>
       </w:r>
     </w:p>
     <w:p>
       <w:pPr>
         <w:pStyle w:val="Ttulo2"/>
+        <w:rPr>
+          <w:lang w:val="es-PE"/>
+        </w:rPr>
       </w:pPr>
       <w:bookmarkStart w:id="71" w:name="_Toc234752999"/>
+      <w:proofErr w:type="spellStart"/>
       <w:r>
         <w:rPr>
           <w:rFonts w:ascii="Calibri" w:hAnsi="Calibri"/>
           <w:color w:val="004C99"/>
-        </w:rPr>
-        <w:t>Frontend Dockerfile</w:t>
+          <w:lang w:val="es-PE"/>
+        </w:rPr>
+        <w:t>Frontend</w:t>
+      </w:r>
+      <w:proofErr w:type="spellEnd"/>
+      <w:r>
+        <w:rPr>
+          <w:rFonts w:ascii="Calibri" w:hAnsi="Calibri"/>
+          <w:color w:val="004C99"/>
+          <w:lang w:val="es-PE"/>
+        </w:rPr>
+        <w:t xml:space="preserve"> </w:t>
+      </w:r>
+      <w:proofErr w:type="spellStart"/>
+      <w:r>
+        <w:rPr>
+          <w:rFonts w:ascii="Calibri" w:hAnsi="Calibri"/>
+          <w:color w:val="004C99"/>
+          <w:lang w:val="es-PE"/>
+        </w:rPr>
+        <w:t>Dockerfile</w:t>
       </w:r>
       <w:bookmarkEnd w:id="71"/>
+      <w:proofErr w:type="spellEnd"/>
     </w:p>
     <w:p>
-      <w:r>
-        <w:t>Multi-etapa: build con node:22-alpine, sirve con nginx:alpine. Expone puerto 80. Incluye nginx.conf con proxy reverse a ba</w:t>
-      </w:r>
-      <w:r>
-        <w:t>ckend.</w:t>
+      <w:pPr>
+        <w:rPr>
+          <w:lang w:val="es-PE"/>
+        </w:rPr>
+      </w:pPr>
+      <w:proofErr w:type="spellStart"/>
+      <w:r>
+        <w:rPr>
+          <w:lang w:val="es-PE"/>
+        </w:rPr>
+        <w:t>Multi-etapa</w:t>
+      </w:r>
+      <w:proofErr w:type="spellEnd"/>
+      <w:r>
+        <w:rPr>
+          <w:lang w:val="es-PE"/>
+        </w:rPr>
+        <w:t xml:space="preserve">: </w:t>
+      </w:r>
+      <w:proofErr w:type="spellStart"/>
+      <w:r>
+        <w:rPr>
+          <w:lang w:val="es-PE"/>
+        </w:rPr>
+        <w:t>build</w:t>
+      </w:r>
+      <w:proofErr w:type="spellEnd"/>
+      <w:r>
+        <w:rPr>
+          <w:lang w:val="es-PE"/>
+        </w:rPr>
+        <w:t xml:space="preserve"> con node:22-alpine, sirve con </w:t>
+      </w:r>
+      <w:proofErr w:type="spellStart"/>
+      <w:proofErr w:type="gramStart"/>
+      <w:r>
+        <w:rPr>
+          <w:lang w:val="es-PE"/>
+        </w:rPr>
+        <w:t>nginx:alpine</w:t>
+      </w:r>
+      <w:proofErr w:type="spellEnd"/>
+      <w:proofErr w:type="gramEnd"/>
+      <w:r>
+        <w:rPr>
+          <w:lang w:val="es-PE"/>
+        </w:rPr>
+        <w:t xml:space="preserve">. Expone puerto 80. Incluye </w:t>
+      </w:r>
+      <w:proofErr w:type="spellStart"/>
+      <w:r>
+        <w:rPr>
+          <w:lang w:val="es-PE"/>
+        </w:rPr>
+        <w:t>nginx.conf</w:t>
+      </w:r>
+      <w:proofErr w:type="spellEnd"/>
+      <w:r>
+        <w:rPr>
+          <w:lang w:val="es-PE"/>
+        </w:rPr>
+        <w:t xml:space="preserve"> con proxy reverse a </w:t>
+      </w:r>
+      <w:proofErr w:type="spellStart"/>
+      <w:r>
+        <w:rPr>
+          <w:lang w:val="es-PE"/>
+        </w:rPr>
+        <w:t>backend</w:t>
+      </w:r>
+      <w:proofErr w:type="spellEnd"/>
+      <w:r>
+        <w:rPr>
+          <w:lang w:val="es-PE"/>
+        </w:rPr>
+        <w:t>.</w:t>
       </w:r>
     </w:p>
     <w:p>
@@ -19116,9 +19649,18 @@
           <w:rFonts w:ascii="Calibri" w:hAnsi="Calibri"/>
           <w:color w:val="004C99"/>
         </w:rPr>
-        <w:t>docker-compose.yml</w:t>
+        <w:t>docker-</w:t>
+      </w:r>
+      <w:proofErr w:type="spellStart"/>
+      <w:r>
+        <w:rPr>
+          <w:rFonts w:ascii="Calibri" w:hAnsi="Calibri"/>
+          <w:color w:val="004C99"/>
+        </w:rPr>
+        <w:t>compose.yml</w:t>
       </w:r>
       <w:bookmarkEnd w:id="72"/>
+      <w:proofErr w:type="spellEnd"/>
     </w:p>
     <w:p>
       <w:r>
@@ -19187,8 +19729,14 @@
     <w:p>
       <w:pPr>
         <w:pStyle w:val="Listaconvietas"/>
+        <w:rPr>
+          <w:lang w:val="es-PE"/>
+        </w:rPr>
       </w:pPr>
       <w:r>
+        <w:rPr>
+          <w:lang w:val="es-PE"/>
+        </w:rPr>
         <w:t>Variable: VITE_API_URL=https://backend.onrender.com/api</w:t>
       </w:r>
     </w:p>
@@ -19249,46 +19797,132 @@
     <w:p>
       <w:pPr>
         <w:pStyle w:val="Ttulo2"/>
+        <w:rPr>
+          <w:lang w:val="es-PE"/>
+        </w:rPr>
       </w:pPr>
       <w:bookmarkStart w:id="76" w:name="_Toc234753004"/>
       <w:r>
         <w:rPr>
           <w:rFonts w:ascii="Calibri" w:hAnsi="Calibri"/>
           <w:color w:val="004C99"/>
-        </w:rPr>
-        <w:t>PostgreSQL en Aive</w:t>
-      </w:r>
+          <w:lang w:val="es-PE"/>
+        </w:rPr>
+        <w:t xml:space="preserve">PostgreSQL en </w:t>
+      </w:r>
+      <w:proofErr w:type="spellStart"/>
       <w:r>
         <w:rPr>
           <w:rFonts w:ascii="Calibri" w:hAnsi="Calibri"/>
           <w:color w:val="004C99"/>
-        </w:rPr>
-        <w:t>n</w:t>
+          <w:lang w:val="es-PE"/>
+        </w:rPr>
+        <w:t>Aiven</w:t>
       </w:r>
       <w:bookmarkEnd w:id="76"/>
+      <w:proofErr w:type="spellEnd"/>
     </w:p>
     <w:p>
-      <w:r>
-        <w:t>Host, Puerto (5432), Base de datos, Usuario, Contrasena, SSL requerido.</w:t>
+      <w:pPr>
+        <w:rPr>
+          <w:lang w:val="es-PE"/>
+        </w:rPr>
+      </w:pPr>
+      <w:r>
+        <w:rPr>
+          <w:lang w:val="es-PE"/>
+        </w:rPr>
+        <w:t xml:space="preserve">Host, Puerto (5432), Base de datos, Usuario, </w:t>
+      </w:r>
+      <w:proofErr w:type="spellStart"/>
+      <w:r>
+        <w:rPr>
+          <w:lang w:val="es-PE"/>
+        </w:rPr>
+        <w:t>Contrasena</w:t>
+      </w:r>
+      <w:proofErr w:type="spellEnd"/>
+      <w:r>
+        <w:rPr>
+          <w:lang w:val="es-PE"/>
+        </w:rPr>
+        <w:t>, SSL requerido.</w:t>
       </w:r>
     </w:p>
     <w:p>
+      <w:pPr>
+        <w:rPr>
+          <w:lang w:val="es-PE"/>
+        </w:rPr>
+      </w:pPr>
+      <w:proofErr w:type="spellStart"/>
+      <w:proofErr w:type="gramStart"/>
       <w:r>
         <w:rPr>
           <w:rFonts w:ascii="Consolas" w:hAnsi="Consolas"/>
           <w:sz w:val="18"/>
-        </w:rPr>
-        <w:t>jdbc:postgresql://HOST:PUERTO/BASE_DATOS?sslmode=require</w:t>
-      </w:r>
+          <w:lang w:val="es-PE"/>
+        </w:rPr>
+        <w:t>jdbc:postgresql</w:t>
+      </w:r>
+      <w:proofErr w:type="spellEnd"/>
+      <w:r>
+        <w:rPr>
+          <w:rFonts w:ascii="Consolas" w:hAnsi="Consolas"/>
+          <w:sz w:val="18"/>
+          <w:lang w:val="es-PE"/>
+        </w:rPr>
+        <w:t>://HOST:PUERTO/</w:t>
+      </w:r>
+      <w:proofErr w:type="spellStart"/>
+      <w:r>
+        <w:rPr>
+          <w:rFonts w:ascii="Consolas" w:hAnsi="Consolas"/>
+          <w:sz w:val="18"/>
+          <w:lang w:val="es-PE"/>
+        </w:rPr>
+        <w:t>BASE_DATOS?sslmode</w:t>
+      </w:r>
+      <w:proofErr w:type="spellEnd"/>
+      <w:r>
+        <w:rPr>
+          <w:rFonts w:ascii="Consolas" w:hAnsi="Consolas"/>
+          <w:sz w:val="18"/>
+          <w:lang w:val="es-PE"/>
+        </w:rPr>
+        <w:t>=</w:t>
+      </w:r>
+      <w:proofErr w:type="spellStart"/>
+      <w:r>
+        <w:rPr>
+          <w:rFonts w:ascii="Consolas" w:hAnsi="Consolas"/>
+          <w:sz w:val="18"/>
+          <w:lang w:val="es-PE"/>
+        </w:rPr>
+        <w:t>require</w:t>
+      </w:r>
+      <w:proofErr w:type="spellEnd"/>
+      <w:proofErr w:type="gramEnd"/>
     </w:p>
     <w:p>
-      <w:r>
+      <w:pPr>
+        <w:rPr>
+          <w:lang w:val="es-PE"/>
+        </w:rPr>
+      </w:pPr>
+      <w:r>
+        <w:rPr>
+          <w:lang w:val="es-PE"/>
+        </w:rPr>
         <w:br w:type="page"/>
       </w:r>
     </w:p>
     <w:p>
       <w:pPr>
         <w:pStyle w:val="Ttulo1"/>
+        <w:rPr>
+          <w:lang w:val="es-PE"/>
+        </w:rPr>
       </w:pPr>
       <w:bookmarkStart w:id="77" w:name="_Toc234753005"/>
       <w:r>
@@ -19296,6 +19930,7 @@
           <w:rFonts w:ascii="Calibri" w:hAnsi="Calibri"/>
           <w:color w:val="003366"/>
           <w:sz w:val="32"/>
+          <w:lang w:val="es-PE"/>
         </w:rPr>
         <w:lastRenderedPageBreak/>
         <w:t>Mantenimiento</w:t>
@@ -19305,17 +19940,108 @@
     <w:p>
       <w:pPr>
         <w:pStyle w:val="Listaconvietas"/>
+        <w:rPr>
+          <w:lang w:val="es-PE"/>
+        </w:rPr>
       </w:pPr>
-      <w:r>
-        <w:t>Backups: Use pg_dump para respaldos periodicos.</w:t>
+      <w:proofErr w:type="spellStart"/>
+      <w:r>
+        <w:rPr>
+          <w:lang w:val="es-PE"/>
+        </w:rPr>
+        <w:t>Backups</w:t>
+      </w:r>
+      <w:proofErr w:type="spellEnd"/>
+      <w:r>
+        <w:rPr>
+          <w:lang w:val="es-PE"/>
+        </w:rPr>
+        <w:t xml:space="preserve">: Use </w:t>
+      </w:r>
+      <w:proofErr w:type="spellStart"/>
+      <w:r>
+        <w:rPr>
+          <w:lang w:val="es-PE"/>
+        </w:rPr>
+        <w:t>pg_dump</w:t>
+      </w:r>
+      <w:proofErr w:type="spellEnd"/>
+      <w:r>
+        <w:rPr>
+          <w:lang w:val="es-PE"/>
+        </w:rPr>
+        <w:t xml:space="preserve"> para respaldos </w:t>
+      </w:r>
+      <w:proofErr w:type="spellStart"/>
+      <w:r>
+        <w:rPr>
+          <w:lang w:val="es-PE"/>
+        </w:rPr>
+        <w:t>periodicos</w:t>
+      </w:r>
+      <w:proofErr w:type="spellEnd"/>
+      <w:r>
+        <w:rPr>
+          <w:lang w:val="es-PE"/>
+        </w:rPr>
+        <w:t>.</w:t>
+      </w:r>
+    </w:p>
+    <w:p>
+      <w:pPr>
+        <w:pStyle w:val="Listaconvietas"/>
+        <w:rPr>
+          <w:lang w:val="es-PE"/>
+        </w:rPr>
+      </w:pPr>
+      <w:r>
+        <w:rPr>
+          <w:lang w:val="es-PE"/>
+        </w:rPr>
+        <w:t xml:space="preserve">Logs: Revisar logs en Render </w:t>
+      </w:r>
+      <w:proofErr w:type="spellStart"/>
+      <w:r>
+        <w:rPr>
+          <w:lang w:val="es-PE"/>
+        </w:rPr>
+        <w:t>dashboard</w:t>
+      </w:r>
+      <w:proofErr w:type="spellEnd"/>
+      <w:r>
+        <w:rPr>
+          <w:lang w:val="es-PE"/>
+        </w:rPr>
+        <w:t>.</w:t>
       </w:r>
     </w:p>
     <w:p>
       <w:pPr>
         <w:pStyle w:val="Listaconvietas"/>
       </w:pPr>
-      <w:r>
-        <w:t>Logs: Revisar logs en Render dashboard.</w:t>
+      <w:proofErr w:type="spellStart"/>
+      <w:r>
+        <w:t>Actualizaciones</w:t>
+      </w:r>
+      <w:proofErr w:type="spellEnd"/>
+      <w:r>
+        <w:t xml:space="preserve">: </w:t>
+      </w:r>
+      <w:proofErr w:type="spellStart"/>
+      <w:r>
+        <w:t>npm</w:t>
+      </w:r>
+      <w:proofErr w:type="spellEnd"/>
+      <w:r>
+        <w:t xml:space="preserve"> update y mvn </w:t>
+      </w:r>
+      <w:proofErr w:type="gramStart"/>
+      <w:r>
+        <w:t>versions:display</w:t>
+      </w:r>
+      <w:proofErr w:type="gramEnd"/>
+      <w:r>
+        <w:t>-dependency-updates.</w:t>
       </w:r>
     </w:p>
     <w:p>
@@ -19323,7 +20049,43 @@
         <w:pStyle w:val="Listaconvietas"/>
       </w:pPr>
       <w:r>
-        <w:t>Actualizaciones: npm update y mvn versions:display-dependency-updates.</w:t>
+        <w:t>Errores: Monitorear GlobalExceptionHandler y logs.</w:t>
+      </w:r>
+    </w:p>
+    <w:p>
+      <w:pPr>
+        <w:pStyle w:val="Listaconvietas"/>
+        <w:rPr>
+          <w:lang w:val="es-PE"/>
+        </w:rPr>
+      </w:pPr>
+      <w:proofErr w:type="spellStart"/>
+      <w:r>
+        <w:rPr>
+          <w:lang w:val="es-PE"/>
+        </w:rPr>
+        <w:t>Imagenes</w:t>
+      </w:r>
+      <w:proofErr w:type="spellEnd"/>
+      <w:r>
+        <w:rPr>
+          <w:lang w:val="es-PE"/>
+        </w:rPr>
+        <w:t xml:space="preserve">: Revisar espacio en </w:t>
+      </w:r>
+      <w:proofErr w:type="spellStart"/>
+      <w:r>
+        <w:rPr>
+          <w:lang w:val="es-PE"/>
+        </w:rPr>
+        <w:t>upload.dir</w:t>
+      </w:r>
+      <w:proofErr w:type="spellEnd"/>
+      <w:r>
+        <w:rPr>
+          <w:lang w:val="es-PE"/>
+        </w:rPr>
+        <w:t>.</w:t>
       </w:r>
     </w:p>
     <w:p>
@@ -19331,35 +20093,49 @@
         <w:pStyle w:val="Listaconvietas"/>
       </w:pPr>
       <w:r>
-        <w:t>Errores: Monitorear GlobalExceptionHandler y logs.</w:t>
+        <w:t xml:space="preserve">JWT: </w:t>
+      </w:r>
+      <w:proofErr w:type="spellStart"/>
+      <w:r>
+        <w:t>Rotar</w:t>
+      </w:r>
+      <w:proofErr w:type="spellEnd"/>
+      <w:r>
+        <w:t xml:space="preserve"> JWT_SECRET </w:t>
+      </w:r>
+      <w:proofErr w:type="spellStart"/>
+      <w:r>
+        <w:t>periodicamente</w:t>
+      </w:r>
+      <w:proofErr w:type="spellEnd"/>
+      <w:r>
+        <w:t>.</w:t>
       </w:r>
     </w:p>
     <w:p>
       <w:pPr>
         <w:pStyle w:val="Listaconvietas"/>
+        <w:rPr>
+          <w:lang w:val="es-PE"/>
+        </w:rPr>
       </w:pPr>
       <w:r>
-        <w:t>Imagenes: Revisar espacio en upload.dir.</w:t>
+        <w:rPr>
+          <w:lang w:val="es-PE"/>
+        </w:rPr>
+        <w:t>Stock: Revisar inventario de productos regularmente.</w:t>
       </w:r>
     </w:p>
     <w:p>
       <w:pPr>
-        <w:pStyle w:val="Listaconvietas"/>
+        <w:rPr>
+          <w:lang w:val="es-PE"/>
+        </w:rPr>
       </w:pPr>
       <w:r>
-        <w:t>JWT: Rotar JWT_SECRET periodicamente.</w:t>
-      </w:r>
-    </w:p>
-    <w:p>
-      <w:pPr>
-        <w:pStyle w:val="Listaconvietas"/>
-      </w:pPr>
-      <w:r>
-        <w:t>Stock: Revisar inventario de productos regularmente.</w:t>
-      </w:r>
-    </w:p>
-    <w:p>
-      <w:r>
+        <w:rPr>
+          <w:lang w:val="es-PE"/>
+        </w:rPr>
         <w:br w:type="page"/>
       </w:r>
     </w:p>
@@ -19368,6 +20144,7 @@
         <w:pStyle w:val="Ttulo1"/>
       </w:pPr>
       <w:bookmarkStart w:id="78" w:name="_Toc234753006"/>
+      <w:proofErr w:type="spellStart"/>
       <w:r>
         <w:rPr>
           <w:rFonts w:ascii="Calibri" w:hAnsi="Calibri"/>
@@ -19375,9 +20152,46 @@
           <w:sz w:val="32"/>
         </w:rPr>
         <w:lastRenderedPageBreak/>
-        <w:t>Solucion de problemas tecnicos</w:t>
+        <w:t>Solucion</w:t>
+      </w:r>
+      <w:proofErr w:type="spellEnd"/>
+      <w:r>
+        <w:rPr>
+          <w:rFonts w:ascii="Calibri" w:hAnsi="Calibri"/>
+          <w:color w:val="003366"/>
+          <w:sz w:val="32"/>
+        </w:rPr>
+        <w:t xml:space="preserve"> de </w:t>
+      </w:r>
+      <w:proofErr w:type="spellStart"/>
+      <w:r>
+        <w:rPr>
+          <w:rFonts w:ascii="Calibri" w:hAnsi="Calibri"/>
+          <w:color w:val="003366"/>
+          <w:sz w:val="32"/>
+        </w:rPr>
+        <w:t>problemas</w:t>
+      </w:r>
+      <w:proofErr w:type="spellEnd"/>
+      <w:r>
+        <w:rPr>
+          <w:rFonts w:ascii="Calibri" w:hAnsi="Calibri"/>
+          <w:color w:val="003366"/>
+          <w:sz w:val="32"/>
+        </w:rPr>
+        <w:t xml:space="preserve"> </w:t>
+      </w:r>
+      <w:proofErr w:type="spellStart"/>
+      <w:r>
+        <w:rPr>
+          <w:rFonts w:ascii="Calibri" w:hAnsi="Calibri"/>
+          <w:color w:val="003366"/>
+          <w:sz w:val="32"/>
+        </w:rPr>
+        <w:t>tecnicos</w:t>
       </w:r>
       <w:bookmarkEnd w:id="78"/>
+      <w:proofErr w:type="spellEnd"/>
     </w:p>
     <w:tbl>
       <w:tblPr>
@@ -19475,9 +20289,15 @@
             <w:tcW w:w="3135" w:type="dxa"/>
           </w:tcPr>
           <w:p>
-            <w:r>
-              <w:rPr>
-                <w:sz w:val="18"/>
+            <w:pPr>
+              <w:rPr>
+                <w:lang w:val="es-PE"/>
+              </w:rPr>
+            </w:pPr>
+            <w:r>
+              <w:rPr>
+                <w:sz w:val="18"/>
+                <w:lang w:val="es-PE"/>
               </w:rPr>
               <w:t>Token sin permisos o vencido</w:t>
             </w:r>
@@ -19488,9 +20308,15 @@
             <w:tcW w:w="3135" w:type="dxa"/>
           </w:tcPr>
           <w:p>
-            <w:r>
-              <w:rPr>
-                <w:sz w:val="18"/>
+            <w:pPr>
+              <w:rPr>
+                <w:lang w:val="es-PE"/>
+              </w:rPr>
+            </w:pPr>
+            <w:r>
+              <w:rPr>
+                <w:sz w:val="18"/>
+                <w:lang w:val="es-PE"/>
               </w:rPr>
               <w:t>Verificar rol y renovar token.</w:t>
             </w:r>
@@ -19535,11 +20361,33 @@
             <w:shd w:val="clear" w:color="auto" w:fill="F2F7FB"/>
           </w:tcPr>
           <w:p>
-            <w:r>
-              <w:rPr>
-                <w:sz w:val="18"/>
-              </w:rPr>
-              <w:t>Verificar URL y metodo HTTP.</w:t>
+            <w:pPr>
+              <w:rPr>
+                <w:lang w:val="es-PE"/>
+              </w:rPr>
+            </w:pPr>
+            <w:r>
+              <w:rPr>
+                <w:sz w:val="18"/>
+                <w:lang w:val="es-PE"/>
+              </w:rPr>
+              <w:t xml:space="preserve">Verificar URL y </w:t>
+            </w:r>
+            <w:proofErr w:type="spellStart"/>
+            <w:r>
+              <w:rPr>
+                <w:sz w:val="18"/>
+                <w:lang w:val="es-PE"/>
+              </w:rPr>
+              <w:t>metodo</w:t>
+            </w:r>
+            <w:proofErr w:type="spellEnd"/>
+            <w:r>
+              <w:rPr>
+                <w:sz w:val="18"/>
+                <w:lang w:val="es-PE"/>
+              </w:rPr>
+              <w:t xml:space="preserve"> HTTP.</w:t>
             </w:r>
           </w:p>
         </w:tc>
@@ -19579,17 +20427,33 @@
             <w:tcW w:w="3135" w:type="dxa"/>
           </w:tcPr>
           <w:p>
-            <w:r>
-              <w:rPr>
-                <w:sz w:val="18"/>
-              </w:rPr>
-              <w:t xml:space="preserve">Configurar WebConfig con </w:t>
-            </w:r>
-            <w:r>
-              <w:rPr>
-                <w:sz w:val="18"/>
-              </w:rPr>
-              <w:t>origen correcto.</w:t>
+            <w:pPr>
+              <w:rPr>
+                <w:lang w:val="es-PE"/>
+              </w:rPr>
+            </w:pPr>
+            <w:r>
+              <w:rPr>
+                <w:sz w:val="18"/>
+                <w:lang w:val="es-PE"/>
+              </w:rPr>
+              <w:t xml:space="preserve">Configurar </w:t>
+            </w:r>
+            <w:proofErr w:type="spellStart"/>
+            <w:r>
+              <w:rPr>
+                <w:sz w:val="18"/>
+                <w:lang w:val="es-PE"/>
+              </w:rPr>
+              <w:t>WebConfig</w:t>
+            </w:r>
+            <w:proofErr w:type="spellEnd"/>
+            <w:r>
+              <w:rPr>
+                <w:sz w:val="18"/>
+                <w:lang w:val="es-PE"/>
+              </w:rPr>
+              <w:t xml:space="preserve"> con origen correcto.</w:t>
             </w:r>
           </w:p>
         </w:tc>
@@ -19723,9 +20587,15 @@
             <w:shd w:val="clear" w:color="auto" w:fill="F2F7FB"/>
           </w:tcPr>
           <w:p>
-            <w:r>
-              <w:rPr>
-                <w:sz w:val="18"/>
+            <w:pPr>
+              <w:rPr>
+                <w:lang w:val="es-PE"/>
+              </w:rPr>
+            </w:pPr>
+            <w:r>
+              <w:rPr>
+                <w:sz w:val="18"/>
+                <w:lang w:val="es-PE"/>
               </w:rPr>
               <w:t>Esperar 30s o hacer ping preventivo.</w:t>
             </w:r>
@@ -19741,12 +20611,28 @@
             <w:tcW w:w="3135" w:type="dxa"/>
           </w:tcPr>
           <w:p>
-            <w:r>
-              <w:rPr>
-                <w:sz w:val="18"/>
-              </w:rPr>
-              <w:t>Vercel URL antigua</w:t>
-            </w:r>
+            <w:proofErr w:type="spellStart"/>
+            <w:r>
+              <w:rPr>
+                <w:sz w:val="18"/>
+              </w:rPr>
+              <w:t>Vercel</w:t>
+            </w:r>
+            <w:proofErr w:type="spellEnd"/>
+            <w:r>
+              <w:rPr>
+                <w:sz w:val="18"/>
+              </w:rPr>
+              <w:t xml:space="preserve"> URL </w:t>
+            </w:r>
+            <w:proofErr w:type="spellStart"/>
+            <w:r>
+              <w:rPr>
+                <w:sz w:val="18"/>
+              </w:rPr>
+              <w:t>antigua</w:t>
+            </w:r>
+            <w:proofErr w:type="spellEnd"/>
           </w:p>
         </w:tc>
         <w:tc>
@@ -19814,9 +20700,15 @@
             <w:shd w:val="clear" w:color="auto" w:fill="F2F7FB"/>
           </w:tcPr>
           <w:p>
-            <w:r>
-              <w:rPr>
-                <w:sz w:val="18"/>
+            <w:pPr>
+              <w:rPr>
+                <w:lang w:val="es-PE"/>
+              </w:rPr>
+            </w:pPr>
+            <w:r>
+              <w:rPr>
+                <w:sz w:val="18"/>
+                <w:lang w:val="es-PE"/>
               </w:rPr>
               <w:t>Usar Java 21 y verificar JAVA_HOME.</w:t>
             </w:r>
@@ -19836,7 +20728,21 @@
               <w:rPr>
                 <w:sz w:val="18"/>
               </w:rPr>
-              <w:t>Error npm run build</w:t>
+              <w:t xml:space="preserve">Error </w:t>
+            </w:r>
+            <w:proofErr w:type="spellStart"/>
+            <w:r>
+              <w:rPr>
+                <w:sz w:val="18"/>
+              </w:rPr>
+              <w:t>npm</w:t>
+            </w:r>
+            <w:proofErr w:type="spellEnd"/>
+            <w:r>
+              <w:rPr>
+                <w:sz w:val="18"/>
+              </w:rPr>
+              <w:t xml:space="preserve"> run build</w:t>
             </w:r>
           </w:p>
         </w:tc>
@@ -19858,17 +20764,65 @@
             <w:tcW w:w="3135" w:type="dxa"/>
           </w:tcPr>
           <w:p>
-            <w:r>
-              <w:rPr>
-                <w:sz w:val="18"/>
-              </w:rPr>
-              <w:t xml:space="preserve">Borrar node_modules y npm </w:t>
-            </w:r>
-            <w:r>
-              <w:rPr>
-                <w:sz w:val="18"/>
-              </w:rPr>
-              <w:t>install.</w:t>
+            <w:pPr>
+              <w:rPr>
+                <w:lang w:val="es-PE"/>
+              </w:rPr>
+            </w:pPr>
+            <w:r>
+              <w:rPr>
+                <w:sz w:val="18"/>
+                <w:lang w:val="es-PE"/>
+              </w:rPr>
+              <w:t xml:space="preserve">Borrar </w:t>
+            </w:r>
+            <w:proofErr w:type="spellStart"/>
+            <w:r>
+              <w:rPr>
+                <w:sz w:val="18"/>
+                <w:lang w:val="es-PE"/>
+              </w:rPr>
+              <w:t>node_modules</w:t>
+            </w:r>
+            <w:proofErr w:type="spellEnd"/>
+            <w:r>
+              <w:rPr>
+                <w:sz w:val="18"/>
+                <w:lang w:val="es-PE"/>
+              </w:rPr>
+              <w:t xml:space="preserve"> y </w:t>
+            </w:r>
+            <w:proofErr w:type="spellStart"/>
+            <w:r>
+              <w:rPr>
+                <w:sz w:val="18"/>
+                <w:lang w:val="es-PE"/>
+              </w:rPr>
+              <w:t>npm</w:t>
+            </w:r>
+            <w:proofErr w:type="spellEnd"/>
+            <w:r>
+              <w:rPr>
+                <w:sz w:val="18"/>
+                <w:lang w:val="es-PE"/>
+              </w:rPr>
+              <w:t xml:space="preserve"> </w:t>
+            </w:r>
+            <w:proofErr w:type="spellStart"/>
+            <w:r>
+              <w:rPr>
+                <w:sz w:val="18"/>
+                <w:lang w:val="es-PE"/>
+              </w:rPr>
+              <w:t>install</w:t>
+            </w:r>
+            <w:proofErr w:type="spellEnd"/>
+            <w:r>
+              <w:rPr>
+                <w:sz w:val="18"/>
+                <w:lang w:val="es-PE"/>
+              </w:rPr>
+              <w:t>.</w:t>
             </w:r>
           </w:p>
         </w:tc>
@@ -19883,11 +20837,19 @@
             <w:shd w:val="clear" w:color="auto" w:fill="F2F7FB"/>
           </w:tcPr>
           <w:p>
-            <w:r>
-              <w:rPr>
-                <w:sz w:val="18"/>
-              </w:rPr>
-              <w:t>Conflictos Git</w:t>
+            <w:proofErr w:type="spellStart"/>
+            <w:r>
+              <w:rPr>
+                <w:sz w:val="18"/>
+              </w:rPr>
+              <w:t>Conflictos</w:t>
+            </w:r>
+            <w:proofErr w:type="spellEnd"/>
+            <w:r>
+              <w:rPr>
+                <w:sz w:val="18"/>
+              </w:rPr>
+              <w:t xml:space="preserve"> Git</w:t>
             </w:r>
           </w:p>
         </w:tc>
@@ -19911,25 +20873,89 @@
             <w:shd w:val="clear" w:color="auto" w:fill="F2F7FB"/>
           </w:tcPr>
           <w:p>
-            <w:r>
-              <w:rPr>
-                <w:sz w:val="18"/>
-              </w:rPr>
-              <w:t>git merge --abort y resolver manualmente.</w:t>
+            <w:pPr>
+              <w:rPr>
+                <w:lang w:val="es-PE"/>
+              </w:rPr>
+            </w:pPr>
+            <w:proofErr w:type="spellStart"/>
+            <w:r>
+              <w:rPr>
+                <w:sz w:val="18"/>
+                <w:lang w:val="es-PE"/>
+              </w:rPr>
+              <w:t>git</w:t>
+            </w:r>
+            <w:proofErr w:type="spellEnd"/>
+            <w:r>
+              <w:rPr>
+                <w:sz w:val="18"/>
+                <w:lang w:val="es-PE"/>
+              </w:rPr>
+              <w:t xml:space="preserve"> </w:t>
+            </w:r>
+            <w:proofErr w:type="spellStart"/>
+            <w:r>
+              <w:rPr>
+                <w:sz w:val="18"/>
+                <w:lang w:val="es-PE"/>
+              </w:rPr>
+              <w:t>merge</w:t>
+            </w:r>
+            <w:proofErr w:type="spellEnd"/>
+            <w:r>
+              <w:rPr>
+                <w:sz w:val="18"/>
+                <w:lang w:val="es-PE"/>
+              </w:rPr>
+              <w:t xml:space="preserve"> --</w:t>
+            </w:r>
+            <w:proofErr w:type="spellStart"/>
+            <w:r>
+              <w:rPr>
+                <w:sz w:val="18"/>
+                <w:lang w:val="es-PE"/>
+              </w:rPr>
+              <w:t>abort</w:t>
+            </w:r>
+            <w:proofErr w:type="spellEnd"/>
+            <w:r>
+              <w:rPr>
+                <w:sz w:val="18"/>
+                <w:lang w:val="es-PE"/>
+              </w:rPr>
+              <w:t xml:space="preserve"> y resolver manualmente.</w:t>
             </w:r>
           </w:p>
         </w:tc>
       </w:tr>
     </w:tbl>
-    <w:p/>
     <w:p>
-      <w:r>
+      <w:pPr>
+        <w:rPr>
+          <w:lang w:val="es-PE"/>
+        </w:rPr>
+      </w:pPr>
+    </w:p>
+    <w:p>
+      <w:pPr>
+        <w:rPr>
+          <w:lang w:val="es-PE"/>
+        </w:rPr>
+      </w:pPr>
+      <w:r>
+        <w:rPr>
+          <w:lang w:val="es-PE"/>
+        </w:rPr>
         <w:br w:type="page"/>
       </w:r>
     </w:p>
     <w:p>
       <w:pPr>
         <w:pStyle w:val="Ttulo1"/>
+        <w:rPr>
+          <w:lang w:val="es-PE"/>
+        </w:rPr>
       </w:pPr>
       <w:bookmarkStart w:id="79" w:name="_Toc234753007"/>
       <w:r>
@@ -19937,6 +20963,7 @@
           <w:rFonts w:ascii="Calibri" w:hAnsi="Calibri"/>
           <w:color w:val="003366"/>
           <w:sz w:val="32"/>
+          <w:lang w:val="es-PE"/>
         </w:rPr>
         <w:lastRenderedPageBreak/>
         <w:t>Flujo de Git</w:t>
@@ -19944,42 +20971,159 @@
       <w:bookmarkEnd w:id="79"/>
     </w:p>
     <w:p>
-      <w:r>
-        <w:t>Flujo basico recomendado:</w:t>
+      <w:pPr>
+        <w:rPr>
+          <w:lang w:val="es-PE"/>
+        </w:rPr>
+      </w:pPr>
+      <w:r>
+        <w:rPr>
+          <w:lang w:val="es-PE"/>
+        </w:rPr>
+        <w:t xml:space="preserve">Flujo </w:t>
+      </w:r>
+      <w:proofErr w:type="spellStart"/>
+      <w:r>
+        <w:rPr>
+          <w:lang w:val="es-PE"/>
+        </w:rPr>
+        <w:t>basico</w:t>
+      </w:r>
+      <w:proofErr w:type="spellEnd"/>
+      <w:r>
+        <w:rPr>
+          <w:lang w:val="es-PE"/>
+        </w:rPr>
+        <w:t xml:space="preserve"> recomendado:</w:t>
       </w:r>
     </w:p>
     <w:p>
+      <w:pPr>
+        <w:rPr>
+          <w:lang w:val="es-PE"/>
+        </w:rPr>
+      </w:pPr>
+      <w:proofErr w:type="spellStart"/>
       <w:r>
         <w:rPr>
           <w:rFonts w:ascii="Consolas" w:hAnsi="Consolas"/>
           <w:sz w:val="18"/>
-        </w:rPr>
-        <w:t>git status                          # Ver cambios</w:t>
+          <w:lang w:val="es-PE"/>
+        </w:rPr>
+        <w:t>git</w:t>
+      </w:r>
+      <w:proofErr w:type="spellEnd"/>
+      <w:r>
+        <w:rPr>
+          <w:rFonts w:ascii="Consolas" w:hAnsi="Consolas"/>
+          <w:sz w:val="18"/>
+          <w:lang w:val="es-PE"/>
+        </w:rPr>
+        <w:t xml:space="preserve"> status                          # Ver cambios</w:t>
       </w:r>
     </w:p>
     <w:p>
+      <w:pPr>
+        <w:rPr>
+          <w:lang w:val="es-PE"/>
+        </w:rPr>
+      </w:pPr>
+      <w:proofErr w:type="spellStart"/>
       <w:r>
         <w:rPr>
           <w:rFonts w:ascii="Consolas" w:hAnsi="Consolas"/>
           <w:sz w:val="18"/>
-        </w:rPr>
-        <w:t>git add ruta/del/archivo             # Preparar archivos</w:t>
+          <w:lang w:val="es-PE"/>
+        </w:rPr>
+        <w:t>git</w:t>
+      </w:r>
+      <w:proofErr w:type="spellEnd"/>
+      <w:r>
+        <w:rPr>
+          <w:rFonts w:ascii="Consolas" w:hAnsi="Consolas"/>
+          <w:sz w:val="18"/>
+          <w:lang w:val="es-PE"/>
+        </w:rPr>
+        <w:t xml:space="preserve"> </w:t>
+      </w:r>
+      <w:proofErr w:type="spellStart"/>
+      <w:r>
+        <w:rPr>
+          <w:rFonts w:ascii="Consolas" w:hAnsi="Consolas"/>
+          <w:sz w:val="18"/>
+          <w:lang w:val="es-PE"/>
+        </w:rPr>
+        <w:t>add</w:t>
+      </w:r>
+      <w:proofErr w:type="spellEnd"/>
+      <w:r>
+        <w:rPr>
+          <w:rFonts w:ascii="Consolas" w:hAnsi="Consolas"/>
+          <w:sz w:val="18"/>
+          <w:lang w:val="es-PE"/>
+        </w:rPr>
+        <w:t xml:space="preserve"> ruta/del/archivo             # Preparar archivos</w:t>
       </w:r>
     </w:p>
     <w:p>
+      <w:pPr>
+        <w:rPr>
+          <w:lang w:val="es-PE"/>
+        </w:rPr>
+      </w:pPr>
+      <w:proofErr w:type="spellStart"/>
       <w:r>
         <w:rPr>
           <w:rFonts w:ascii="Consolas" w:hAnsi="Consolas"/>
           <w:sz w:val="18"/>
-        </w:rPr>
-        <w:t xml:space="preserve">git commit -m </w:t>
-      </w:r>
+          <w:lang w:val="es-PE"/>
+        </w:rPr>
+        <w:t>git</w:t>
+      </w:r>
+      <w:proofErr w:type="spellEnd"/>
       <w:r>
         <w:rPr>
           <w:rFonts w:ascii="Consolas" w:hAnsi="Consolas"/>
           <w:sz w:val="18"/>
-        </w:rPr>
-        <w:t>"mensaje descriptivo"  # Confirmar cambios</w:t>
+          <w:lang w:val="es-PE"/>
+        </w:rPr>
+        <w:t xml:space="preserve"> </w:t>
+      </w:r>
+      <w:proofErr w:type="spellStart"/>
+      <w:r>
+        <w:rPr>
+          <w:rFonts w:ascii="Consolas" w:hAnsi="Consolas"/>
+          <w:sz w:val="18"/>
+          <w:lang w:val="es-PE"/>
+        </w:rPr>
+        <w:t>commit</w:t>
+      </w:r>
+      <w:proofErr w:type="spellEnd"/>
+      <w:r>
+        <w:rPr>
+          <w:rFonts w:ascii="Consolas" w:hAnsi="Consolas"/>
+          <w:sz w:val="18"/>
+          <w:lang w:val="es-PE"/>
+        </w:rPr>
+        <w:t xml:space="preserve"> -m "mensaje descriptivo</w:t>
+      </w:r>
+      <w:proofErr w:type="gramStart"/>
+      <w:r>
+        <w:rPr>
+          <w:rFonts w:ascii="Consolas" w:hAnsi="Consolas"/>
+          <w:sz w:val="18"/>
+          <w:lang w:val="es-PE"/>
+        </w:rPr>
+        <w:t>"  #</w:t>
+      </w:r>
+      <w:proofErr w:type="gramEnd"/>
+      <w:r>
+        <w:rPr>
+          <w:rFonts w:ascii="Consolas" w:hAnsi="Consolas"/>
+          <w:sz w:val="18"/>
+          <w:lang w:val="es-PE"/>
+        </w:rPr>
+        <w:t xml:space="preserve"> Confirmar cambios</w:t>
       </w:r>
     </w:p>
     <w:p>
@@ -20003,12 +21147,16 @@
     <w:p>
       <w:pPr>
         <w:pStyle w:val="Ttulo2"/>
+        <w:rPr>
+          <w:lang w:val="es-PE"/>
+        </w:rPr>
       </w:pPr>
       <w:bookmarkStart w:id="80" w:name="_Toc234753008"/>
       <w:r>
         <w:rPr>
           <w:rFonts w:ascii="Calibri" w:hAnsi="Calibri"/>
           <w:color w:val="004C99"/>
+          <w:lang w:val="es-PE"/>
         </w:rPr>
         <w:t>Resolver conflictos</w:t>
       </w:r>
@@ -20016,10 +21164,99 @@
     </w:p>
     <w:p>
       <w:r>
-        <w:t>Si hay conflictos al hacer pull, edite los archivos conflictivos, luego git add y git com</w:t>
-      </w:r>
-      <w:r>
-        <w:t>mit. Si desea abortar: git merge --abort.</w:t>
+        <w:rPr>
+          <w:lang w:val="es-PE"/>
+        </w:rPr>
+        <w:t xml:space="preserve">Si hay conflictos al hacer </w:t>
+      </w:r>
+      <w:proofErr w:type="spellStart"/>
+      <w:r>
+        <w:rPr>
+          <w:lang w:val="es-PE"/>
+        </w:rPr>
+        <w:t>pull</w:t>
+      </w:r>
+      <w:proofErr w:type="spellEnd"/>
+      <w:r>
+        <w:rPr>
+          <w:lang w:val="es-PE"/>
+        </w:rPr>
+        <w:t xml:space="preserve">, edite los archivos conflictivos, luego </w:t>
+      </w:r>
+      <w:proofErr w:type="spellStart"/>
+      <w:r>
+        <w:rPr>
+          <w:lang w:val="es-PE"/>
+        </w:rPr>
+        <w:t>git</w:t>
+      </w:r>
+      <w:proofErr w:type="spellEnd"/>
+      <w:r>
+        <w:rPr>
+          <w:lang w:val="es-PE"/>
+        </w:rPr>
+        <w:t xml:space="preserve"> </w:t>
+      </w:r>
+      <w:proofErr w:type="spellStart"/>
+      <w:r>
+        <w:rPr>
+          <w:lang w:val="es-PE"/>
+        </w:rPr>
+        <w:t>add</w:t>
+      </w:r>
+      <w:proofErr w:type="spellEnd"/>
+      <w:r>
+        <w:rPr>
+          <w:lang w:val="es-PE"/>
+        </w:rPr>
+        <w:t xml:space="preserve"> y </w:t>
+      </w:r>
+      <w:proofErr w:type="spellStart"/>
+      <w:r>
+        <w:rPr>
+          <w:lang w:val="es-PE"/>
+        </w:rPr>
+        <w:t>git</w:t>
+      </w:r>
+      <w:proofErr w:type="spellEnd"/>
+      <w:r>
+        <w:rPr>
+          <w:lang w:val="es-PE"/>
+        </w:rPr>
+        <w:t xml:space="preserve"> </w:t>
+      </w:r>
+      <w:proofErr w:type="spellStart"/>
+      <w:r>
+        <w:rPr>
+          <w:lang w:val="es-PE"/>
+        </w:rPr>
+        <w:t>commit</w:t>
+      </w:r>
+      <w:proofErr w:type="spellEnd"/>
+      <w:r>
+        <w:rPr>
+          <w:lang w:val="es-PE"/>
+        </w:rPr>
+        <w:t xml:space="preserve">. </w:t>
+      </w:r>
+      <w:r>
+        <w:t xml:space="preserve">Si </w:t>
+      </w:r>
+      <w:proofErr w:type="spellStart"/>
+      <w:r>
+        <w:t>desea</w:t>
+      </w:r>
+      <w:proofErr w:type="spellEnd"/>
+      <w:r>
+        <w:t xml:space="preserve"> </w:t>
+      </w:r>
+      <w:proofErr w:type="spellStart"/>
+      <w:r>
+        <w:t>abortar</w:t>
+      </w:r>
+      <w:proofErr w:type="spellEnd"/>
+      <w:r>
+        <w:t>: git merge --abort.</w:t>
       </w:r>
     </w:p>
     <w:p>
@@ -20048,54 +21285,167 @@
         <w:pStyle w:val="Listaconvietas"/>
       </w:pPr>
       <w:r>
-        <w:t>No subir secretos al repositorio. Usar .gitignore.</w:t>
+        <w:rPr>
+          <w:lang w:val="es-PE"/>
+        </w:rPr>
+        <w:t xml:space="preserve">No subir secretos al repositorio. </w:t>
+      </w:r>
+      <w:r>
+        <w:t>Usar .</w:t>
+      </w:r>
+      <w:proofErr w:type="spellStart"/>
+      <w:r>
+        <w:t>gitignore</w:t>
+      </w:r>
+      <w:proofErr w:type="spellEnd"/>
+      <w:r>
+        <w:t>.</w:t>
       </w:r>
     </w:p>
     <w:p>
       <w:pPr>
         <w:pStyle w:val="Listaconvietas"/>
+        <w:rPr>
+          <w:lang w:val="es-PE"/>
+        </w:rPr>
       </w:pPr>
-      <w:r>
-        <w:t>Mantener .env.example actualizado sin valores reales.</w:t>
+      <w:proofErr w:type="gramStart"/>
+      <w:r>
+        <w:rPr>
+          <w:lang w:val="es-PE"/>
+        </w:rPr>
+        <w:t>Mantener .</w:t>
+      </w:r>
+      <w:proofErr w:type="spellStart"/>
+      <w:r>
+        <w:rPr>
+          <w:lang w:val="es-PE"/>
+        </w:rPr>
+        <w:t>env</w:t>
+      </w:r>
+      <w:proofErr w:type="gramEnd"/>
+      <w:r>
+        <w:rPr>
+          <w:lang w:val="es-PE"/>
+        </w:rPr>
+        <w:t>.example</w:t>
+      </w:r>
+      <w:proofErr w:type="spellEnd"/>
+      <w:r>
+        <w:rPr>
+          <w:lang w:val="es-PE"/>
+        </w:rPr>
+        <w:t xml:space="preserve"> actualizado sin valores reales.</w:t>
       </w:r>
     </w:p>
     <w:p>
       <w:pPr>
         <w:pStyle w:val="Listaconvietas"/>
+        <w:rPr>
+          <w:lang w:val="es-PE"/>
+        </w:rPr>
       </w:pPr>
       <w:r>
-        <w:t>Rotar JWT_SECRET y credenciales de BD periodicamente.</w:t>
+        <w:rPr>
+          <w:lang w:val="es-PE"/>
+        </w:rPr>
+        <w:t xml:space="preserve">Rotar JWT_SECRET y credenciales de BD </w:t>
+      </w:r>
+      <w:proofErr w:type="spellStart"/>
+      <w:r>
+        <w:rPr>
+          <w:lang w:val="es-PE"/>
+        </w:rPr>
+        <w:t>periodicamente</w:t>
+      </w:r>
+      <w:proofErr w:type="spellEnd"/>
+      <w:r>
+        <w:rPr>
+          <w:lang w:val="es-PE"/>
+        </w:rPr>
+        <w:t>.</w:t>
       </w:r>
     </w:p>
     <w:p>
       <w:pPr>
         <w:pStyle w:val="Listaconvietas"/>
+        <w:rPr>
+          <w:lang w:val="es-PE"/>
+        </w:rPr>
       </w:pPr>
       <w:r>
-        <w:t xml:space="preserve">Validar precios y datos </w:t>
-      </w:r>
-      <w:r>
-        <w:t>en el servidor, no confiar en datos del cliente.</w:t>
+        <w:rPr>
+          <w:lang w:val="es-PE"/>
+        </w:rPr>
+        <w:t>Validar precios y datos en el servidor, no confiar en datos del cliente.</w:t>
       </w:r>
     </w:p>
     <w:p>
       <w:pPr>
         <w:pStyle w:val="Listaconvietas"/>
+        <w:rPr>
+          <w:lang w:val="es-PE"/>
+        </w:rPr>
       </w:pPr>
       <w:r>
-        <w:t>Control de permisos: verificar rol ADMIN en cada endpoint protegido.</w:t>
+        <w:rPr>
+          <w:lang w:val="es-PE"/>
+        </w:rPr>
+        <w:t xml:space="preserve">Control de permisos: verificar rol ADMIN en cada </w:t>
+      </w:r>
+      <w:proofErr w:type="spellStart"/>
+      <w:r>
+        <w:rPr>
+          <w:lang w:val="es-PE"/>
+        </w:rPr>
+        <w:t>endpoint</w:t>
+      </w:r>
+      <w:proofErr w:type="spellEnd"/>
+      <w:r>
+        <w:rPr>
+          <w:lang w:val="es-PE"/>
+        </w:rPr>
+        <w:t xml:space="preserve"> protegido.</w:t>
       </w:r>
     </w:p>
     <w:p>
       <w:pPr>
         <w:pStyle w:val="Listaconvietas"/>
+        <w:rPr>
+          <w:lang w:val="es-PE"/>
+        </w:rPr>
       </w:pPr>
       <w:r>
-        <w:t>Realizar copias de seguridad periodicas de la base de datos.</w:t>
+        <w:rPr>
+          <w:lang w:val="es-PE"/>
+        </w:rPr>
+        <w:t xml:space="preserve">Realizar copias de seguridad </w:t>
+      </w:r>
+      <w:proofErr w:type="spellStart"/>
+      <w:r>
+        <w:rPr>
+          <w:lang w:val="es-PE"/>
+        </w:rPr>
+        <w:t>periodicas</w:t>
+      </w:r>
+      <w:proofErr w:type="spellEnd"/>
+      <w:r>
+        <w:rPr>
+          <w:lang w:val="es-PE"/>
+        </w:rPr>
+        <w:t xml:space="preserve"> de la base de datos.</w:t>
       </w:r>
     </w:p>
     <w:p>
-      <w:r>
+      <w:pPr>
+        <w:rPr>
+          <w:lang w:val="es-PE"/>
+        </w:rPr>
+      </w:pPr>
+      <w:r>
+        <w:rPr>
+          <w:lang w:val="es-PE"/>
+        </w:rPr>
         <w:br w:type="page"/>
       </w:r>
     </w:p>
@@ -20104,6 +21454,7 @@
         <w:pStyle w:val="Ttulo1"/>
       </w:pPr>
       <w:bookmarkStart w:id="82" w:name="_Toc234753010"/>
+      <w:proofErr w:type="spellStart"/>
       <w:r>
         <w:rPr>
           <w:rFonts w:ascii="Calibri" w:hAnsi="Calibri"/>
@@ -20114,6 +21465,7 @@
         <w:t>Anexos</w:t>
       </w:r>
       <w:bookmarkEnd w:id="82"/>
+      <w:proofErr w:type="spellEnd"/>
     </w:p>
     <w:p>
       <w:pPr>
@@ -20783,9 +22135,15 @@
             <w:tcW w:w="4703" w:type="dxa"/>
           </w:tcPr>
           <w:p>
+            <w:pPr>
+              <w:rPr>
+                <w:lang w:val="es-PE"/>
+              </w:rPr>
+            </w:pPr>
             <w:r>
               <w:rPr>
                 <w:sz w:val="20"/>
+                <w:lang w:val="es-PE"/>
               </w:rPr>
               <w:t>Estilo de arquitectura para servicios web que usa HTTP.</w:t>
             </w:r>
@@ -20815,11 +22173,33 @@
             <w:tcW w:w="4703" w:type="dxa"/>
           </w:tcPr>
           <w:p>
+            <w:pPr>
+              <w:rPr>
+                <w:lang w:val="es-PE"/>
+              </w:rPr>
+            </w:pPr>
             <w:r>
               <w:rPr>
                 <w:sz w:val="20"/>
-              </w:rPr>
-              <w:t>Mecanismo de seguridad para solicitudes entre origenes.</w:t>
+                <w:lang w:val="es-PE"/>
+              </w:rPr>
+              <w:t xml:space="preserve">Mecanismo de seguridad para solicitudes entre </w:t>
+            </w:r>
+            <w:proofErr w:type="spellStart"/>
+            <w:r>
+              <w:rPr>
+                <w:sz w:val="20"/>
+                <w:lang w:val="es-PE"/>
+              </w:rPr>
+              <w:t>origenes</w:t>
+            </w:r>
+            <w:proofErr w:type="spellEnd"/>
+            <w:r>
+              <w:rPr>
+                <w:sz w:val="20"/>
+                <w:lang w:val="es-PE"/>
+              </w:rPr>
+              <w:t>.</w:t>
             </w:r>
           </w:p>
         </w:tc>
@@ -20847,11 +22227,33 @@
             <w:tcW w:w="4703" w:type="dxa"/>
           </w:tcPr>
           <w:p>
+            <w:pPr>
+              <w:rPr>
+                <w:lang w:val="es-PE"/>
+              </w:rPr>
+            </w:pPr>
             <w:r>
               <w:rPr>
                 <w:sz w:val="20"/>
-              </w:rPr>
-              <w:t>Operaciones basicas: Crear, Leer, Actualizar, Eliminar.</w:t>
+                <w:lang w:val="es-PE"/>
+              </w:rPr>
+              <w:t xml:space="preserve">Operaciones </w:t>
+            </w:r>
+            <w:proofErr w:type="spellStart"/>
+            <w:r>
+              <w:rPr>
+                <w:sz w:val="20"/>
+                <w:lang w:val="es-PE"/>
+              </w:rPr>
+              <w:t>basicas</w:t>
+            </w:r>
+            <w:proofErr w:type="spellEnd"/>
+            <w:r>
+              <w:rPr>
+                <w:sz w:val="20"/>
+                <w:lang w:val="es-PE"/>
+              </w:rPr>
+              <w:t>: Crear, Leer, Actualizar, Eliminar.</w:t>
             </w:r>
           </w:p>
         </w:tc>
@@ -20879,9 +22281,15 @@
             <w:tcW w:w="4703" w:type="dxa"/>
           </w:tcPr>
           <w:p>
+            <w:pPr>
+              <w:rPr>
+                <w:lang w:val="es-PE"/>
+              </w:rPr>
+            </w:pPr>
             <w:r>
               <w:rPr>
                 <w:sz w:val="20"/>
+                <w:lang w:val="es-PE"/>
               </w:rPr>
               <w:t>Objeto de transferencia de datos entre capas.</w:t>
             </w:r>
@@ -20911,11 +22319,49 @@
             <w:tcW w:w="4703" w:type="dxa"/>
           </w:tcPr>
           <w:p>
+            <w:pPr>
+              <w:rPr>
+                <w:lang w:val="es-PE"/>
+              </w:rPr>
+            </w:pPr>
             <w:r>
               <w:rPr>
                 <w:sz w:val="20"/>
-              </w:rPr>
-              <w:t>Java Persistence API, especificacion para ORM en Java.</w:t>
+                <w:lang w:val="es-PE"/>
+              </w:rPr>
+              <w:t xml:space="preserve">Java </w:t>
+            </w:r>
+            <w:proofErr w:type="spellStart"/>
+            <w:r>
+              <w:rPr>
+                <w:sz w:val="20"/>
+                <w:lang w:val="es-PE"/>
+              </w:rPr>
+              <w:t>Persistence</w:t>
+            </w:r>
+            <w:proofErr w:type="spellEnd"/>
+            <w:r>
+              <w:rPr>
+                <w:sz w:val="20"/>
+                <w:lang w:val="es-PE"/>
+              </w:rPr>
+              <w:t xml:space="preserve"> API, </w:t>
+            </w:r>
+            <w:proofErr w:type="spellStart"/>
+            <w:r>
+              <w:rPr>
+                <w:sz w:val="20"/>
+                <w:lang w:val="es-PE"/>
+              </w:rPr>
+              <w:t>especificacion</w:t>
+            </w:r>
+            <w:proofErr w:type="spellEnd"/>
+            <w:r>
+              <w:rPr>
+                <w:sz w:val="20"/>
+                <w:lang w:val="es-PE"/>
+              </w:rPr>
+              <w:t xml:space="preserve"> para ORM en Java.</w:t>
             </w:r>
           </w:p>
         </w:tc>
@@ -20943,11 +22389,49 @@
             <w:tcW w:w="4703" w:type="dxa"/>
           </w:tcPr>
           <w:p>
+            <w:pPr>
+              <w:rPr>
+                <w:lang w:val="es-PE"/>
+              </w:rPr>
+            </w:pPr>
             <w:r>
               <w:rPr>
                 <w:sz w:val="20"/>
-              </w:rPr>
-              <w:t>JSON Web Token, estandar para autenticacion.</w:t>
+                <w:lang w:val="es-PE"/>
+              </w:rPr>
+              <w:t xml:space="preserve">JSON Web Token, </w:t>
+            </w:r>
+            <w:proofErr w:type="spellStart"/>
+            <w:r>
+              <w:rPr>
+                <w:sz w:val="20"/>
+                <w:lang w:val="es-PE"/>
+              </w:rPr>
+              <w:t>estandar</w:t>
+            </w:r>
+            <w:proofErr w:type="spellEnd"/>
+            <w:r>
+              <w:rPr>
+                <w:sz w:val="20"/>
+                <w:lang w:val="es-PE"/>
+              </w:rPr>
+              <w:t xml:space="preserve"> para </w:t>
+            </w:r>
+            <w:proofErr w:type="spellStart"/>
+            <w:r>
+              <w:rPr>
+                <w:sz w:val="20"/>
+                <w:lang w:val="es-PE"/>
+              </w:rPr>
+              <w:t>autenticacion</w:t>
+            </w:r>
+            <w:proofErr w:type="spellEnd"/>
+            <w:r>
+              <w:rPr>
+                <w:sz w:val="20"/>
+                <w:lang w:val="es-PE"/>
+              </w:rPr>
+              <w:t>.</w:t>
             </w:r>
           </w:p>
         </w:tc>
@@ -20975,17 +22459,33 @@
             <w:tcW w:w="4703" w:type="dxa"/>
           </w:tcPr>
           <w:p>
+            <w:pPr>
+              <w:rPr>
+                <w:lang w:val="es-PE"/>
+              </w:rPr>
+            </w:pPr>
             <w:r>
               <w:rPr>
                 <w:sz w:val="20"/>
-              </w:rPr>
-              <w:t xml:space="preserve">Mapeo </w:t>
-            </w:r>
+                <w:lang w:val="es-PE"/>
+              </w:rPr>
+              <w:t xml:space="preserve">Mapeo objeto-relacional, </w:t>
+            </w:r>
+            <w:proofErr w:type="spellStart"/>
             <w:r>
               <w:rPr>
                 <w:sz w:val="20"/>
-              </w:rPr>
-              <w:t>objeto-relacional, tecnica para persistencia.</w:t>
+                <w:lang w:val="es-PE"/>
+              </w:rPr>
+              <w:t>tecnica</w:t>
+            </w:r>
+            <w:proofErr w:type="spellEnd"/>
+            <w:r>
+              <w:rPr>
+                <w:sz w:val="20"/>
+                <w:lang w:val="es-PE"/>
+              </w:rPr>
+              <w:t xml:space="preserve"> para persistencia.</w:t>
             </w:r>
           </w:p>
         </w:tc>
@@ -21013,29 +22513,117 @@
             <w:tcW w:w="4703" w:type="dxa"/>
           </w:tcPr>
           <w:p>
+            <w:pPr>
+              <w:rPr>
+                <w:lang w:val="es-PE"/>
+              </w:rPr>
+            </w:pPr>
             <w:r>
               <w:rPr>
                 <w:sz w:val="20"/>
-              </w:rPr>
-              <w:t>Single Page Application, aplicacion de una sola pagina.</w:t>
+                <w:lang w:val="es-PE"/>
+              </w:rPr>
+              <w:t xml:space="preserve">Single Page </w:t>
+            </w:r>
+            <w:proofErr w:type="spellStart"/>
+            <w:r>
+              <w:rPr>
+                <w:sz w:val="20"/>
+                <w:lang w:val="es-PE"/>
+              </w:rPr>
+              <w:t>Application</w:t>
+            </w:r>
+            <w:proofErr w:type="spellEnd"/>
+            <w:r>
+              <w:rPr>
+                <w:sz w:val="20"/>
+                <w:lang w:val="es-PE"/>
+              </w:rPr>
+              <w:t xml:space="preserve">, </w:t>
+            </w:r>
+            <w:proofErr w:type="spellStart"/>
+            <w:r>
+              <w:rPr>
+                <w:sz w:val="20"/>
+                <w:lang w:val="es-PE"/>
+              </w:rPr>
+              <w:t>aplicacion</w:t>
+            </w:r>
+            <w:proofErr w:type="spellEnd"/>
+            <w:r>
+              <w:rPr>
+                <w:sz w:val="20"/>
+                <w:lang w:val="es-PE"/>
+              </w:rPr>
+              <w:t xml:space="preserve"> de una sola </w:t>
+            </w:r>
+            <w:proofErr w:type="spellStart"/>
+            <w:r>
+              <w:rPr>
+                <w:sz w:val="20"/>
+                <w:lang w:val="es-PE"/>
+              </w:rPr>
+              <w:t>pagina</w:t>
+            </w:r>
+            <w:proofErr w:type="spellEnd"/>
+            <w:r>
+              <w:rPr>
+                <w:sz w:val="20"/>
+                <w:lang w:val="es-PE"/>
+              </w:rPr>
+              <w:t>.</w:t>
             </w:r>
           </w:p>
         </w:tc>
       </w:tr>
     </w:tbl>
-    <w:p/>
+    <w:p>
+      <w:pPr>
+        <w:rPr>
+          <w:lang w:val="es-PE"/>
+        </w:rPr>
+      </w:pPr>
+    </w:p>
     <w:p>
       <w:pPr>
         <w:pStyle w:val="Ttulo1"/>
       </w:pPr>
       <w:bookmarkStart w:id="86" w:name="_Toc234753014"/>
+      <w:proofErr w:type="spellStart"/>
       <w:r>
         <w:rPr>
           <w:rFonts w:ascii="Calibri" w:hAnsi="Calibri"/>
           <w:color w:val="003366"/>
           <w:sz w:val="32"/>
         </w:rPr>
-        <w:t>Historial de versiones del documento</w:t>
+        <w:t>Historial</w:t>
+      </w:r>
+      <w:proofErr w:type="spellEnd"/>
+      <w:r>
+        <w:rPr>
+          <w:rFonts w:ascii="Calibri" w:hAnsi="Calibri"/>
+          <w:color w:val="003366"/>
+          <w:sz w:val="32"/>
+        </w:rPr>
+        <w:t xml:space="preserve"> de </w:t>
+      </w:r>
+      <w:proofErr w:type="spellStart"/>
+      <w:r>
+        <w:rPr>
+          <w:rFonts w:ascii="Calibri" w:hAnsi="Calibri"/>
+          <w:color w:val="003366"/>
+          <w:sz w:val="32"/>
+        </w:rPr>
+        <w:t>versiones</w:t>
+      </w:r>
+      <w:proofErr w:type="spellEnd"/>
+      <w:r>
+        <w:rPr>
+          <w:rFonts w:ascii="Calibri" w:hAnsi="Calibri"/>
+          <w:color w:val="003366"/>
+          <w:sz w:val="32"/>
+        </w:rPr>
+        <w:t xml:space="preserve"> del documento</w:t>
       </w:r>
       <w:bookmarkEnd w:id="86"/>
     </w:p>
@@ -21176,19 +22764,225 @@
       <w:bookmarkEnd w:id="87"/>
     </w:p>
     <w:p>
-      <w:r>
-        <w:t xml:space="preserve">La Guia </w:t>
-      </w:r>
-      <w:r>
-        <w:t>Tecnica de Heladeria Conejito proporciona una referencia completa para desarrolladores y responsables del despliegue. Se ha documentado la arquitectura, tecnologias, configuracion, endpoints, seguridad y procedimientos de instalacion y despliegue del siste</w:t>
-      </w:r>
-      <w:r>
-        <w:t>ma.</w:t>
+      <w:pPr>
+        <w:rPr>
+          <w:lang w:val="es-PE"/>
+        </w:rPr>
+      </w:pPr>
+      <w:r>
+        <w:rPr>
+          <w:lang w:val="es-PE"/>
+        </w:rPr>
+        <w:t xml:space="preserve">La </w:t>
+      </w:r>
+      <w:proofErr w:type="spellStart"/>
+      <w:r>
+        <w:rPr>
+          <w:lang w:val="es-PE"/>
+        </w:rPr>
+        <w:t>Guia</w:t>
+      </w:r>
+      <w:proofErr w:type="spellEnd"/>
+      <w:r>
+        <w:rPr>
+          <w:lang w:val="es-PE"/>
+        </w:rPr>
+        <w:t xml:space="preserve"> </w:t>
+      </w:r>
+      <w:proofErr w:type="spellStart"/>
+      <w:r>
+        <w:rPr>
+          <w:lang w:val="es-PE"/>
+        </w:rPr>
+        <w:t>Tecnica</w:t>
+      </w:r>
+      <w:proofErr w:type="spellEnd"/>
+      <w:r>
+        <w:rPr>
+          <w:lang w:val="es-PE"/>
+        </w:rPr>
+        <w:t xml:space="preserve"> de </w:t>
+      </w:r>
+      <w:proofErr w:type="spellStart"/>
+      <w:r>
+        <w:rPr>
+          <w:lang w:val="es-PE"/>
+        </w:rPr>
+        <w:t>Heladeria</w:t>
+      </w:r>
+      <w:proofErr w:type="spellEnd"/>
+      <w:r>
+        <w:rPr>
+          <w:lang w:val="es-PE"/>
+        </w:rPr>
+        <w:t xml:space="preserve"> Conejito proporciona una referencia completa para desarrolladores y responsables del despliegue. Se ha documentado la arquitectura, </w:t>
+      </w:r>
+      <w:proofErr w:type="spellStart"/>
+      <w:r>
+        <w:rPr>
+          <w:lang w:val="es-PE"/>
+        </w:rPr>
+        <w:t>tecnologias</w:t>
+      </w:r>
+      <w:proofErr w:type="spellEnd"/>
+      <w:r>
+        <w:rPr>
+          <w:lang w:val="es-PE"/>
+        </w:rPr>
+        <w:t xml:space="preserve">, </w:t>
+      </w:r>
+      <w:proofErr w:type="spellStart"/>
+      <w:r>
+        <w:rPr>
+          <w:lang w:val="es-PE"/>
+        </w:rPr>
+        <w:t>configuracion</w:t>
+      </w:r>
+      <w:proofErr w:type="spellEnd"/>
+      <w:r>
+        <w:rPr>
+          <w:lang w:val="es-PE"/>
+        </w:rPr>
+        <w:t xml:space="preserve">, </w:t>
+      </w:r>
+      <w:proofErr w:type="spellStart"/>
+      <w:r>
+        <w:rPr>
+          <w:lang w:val="es-PE"/>
+        </w:rPr>
+        <w:t>endpoints</w:t>
+      </w:r>
+      <w:proofErr w:type="spellEnd"/>
+      <w:r>
+        <w:rPr>
+          <w:lang w:val="es-PE"/>
+        </w:rPr>
+        <w:t xml:space="preserve">, seguridad y procedimientos de </w:t>
+      </w:r>
+      <w:proofErr w:type="spellStart"/>
+      <w:r>
+        <w:rPr>
+          <w:lang w:val="es-PE"/>
+        </w:rPr>
+        <w:t>instalacion</w:t>
+      </w:r>
+      <w:proofErr w:type="spellEnd"/>
+      <w:r>
+        <w:rPr>
+          <w:lang w:val="es-PE"/>
+        </w:rPr>
+        <w:t xml:space="preserve"> y despliegue del sistema.</w:t>
       </w:r>
     </w:p>
     <w:p>
-      <w:r>
-        <w:t>El sistema utiliza tecnologias modernas y sigue las mejores practicas de desarrollo web, incluyendo autenticacion JWT, API REST, contenedorizacion con Docker y despliegue en plataformas cloud (Vercel, Render, Aiven).</w:t>
+      <w:pPr>
+        <w:rPr>
+          <w:lang w:val="es-PE"/>
+        </w:rPr>
+      </w:pPr>
+      <w:r>
+        <w:rPr>
+          <w:lang w:val="es-PE"/>
+        </w:rPr>
+        <w:t xml:space="preserve">El sistema utiliza </w:t>
+      </w:r>
+      <w:proofErr w:type="spellStart"/>
+      <w:r>
+        <w:rPr>
+          <w:lang w:val="es-PE"/>
+        </w:rPr>
+        <w:t>tecnologias</w:t>
+      </w:r>
+      <w:proofErr w:type="spellEnd"/>
+      <w:r>
+        <w:rPr>
+          <w:lang w:val="es-PE"/>
+        </w:rPr>
+        <w:t xml:space="preserve"> modernas y sigue las mejores </w:t>
+      </w:r>
+      <w:proofErr w:type="spellStart"/>
+      <w:r>
+        <w:rPr>
+          <w:lang w:val="es-PE"/>
+        </w:rPr>
+        <w:t>practicas</w:t>
+      </w:r>
+      <w:proofErr w:type="spellEnd"/>
+      <w:r>
+        <w:rPr>
+          <w:lang w:val="es-PE"/>
+        </w:rPr>
+        <w:t xml:space="preserve"> de desarrollo web, incluyendo </w:t>
+      </w:r>
+      <w:proofErr w:type="spellStart"/>
+      <w:r>
+        <w:rPr>
+          <w:lang w:val="es-PE"/>
+        </w:rPr>
+        <w:t>autenticacion</w:t>
+      </w:r>
+      <w:proofErr w:type="spellEnd"/>
+      <w:r>
+        <w:rPr>
+          <w:lang w:val="es-PE"/>
+        </w:rPr>
+        <w:t xml:space="preserve"> JWT, API REST, </w:t>
+      </w:r>
+      <w:proofErr w:type="spellStart"/>
+      <w:r>
+        <w:rPr>
+          <w:lang w:val="es-PE"/>
+        </w:rPr>
+        <w:t>contenedorizacion</w:t>
+      </w:r>
+      <w:proofErr w:type="spellEnd"/>
+      <w:r>
+        <w:rPr>
+          <w:lang w:val="es-PE"/>
+        </w:rPr>
+        <w:t xml:space="preserve"> con Docker y despliegue en plataformas </w:t>
+      </w:r>
+      <w:proofErr w:type="spellStart"/>
+      <w:r>
+        <w:rPr>
+          <w:lang w:val="es-PE"/>
+        </w:rPr>
+        <w:t>cloud</w:t>
+      </w:r>
+      <w:proofErr w:type="spellEnd"/>
+      <w:r>
+        <w:rPr>
+          <w:lang w:val="es-PE"/>
+        </w:rPr>
+        <w:t xml:space="preserve"> (</w:t>
+      </w:r>
+      <w:proofErr w:type="spellStart"/>
+      <w:r>
+        <w:rPr>
+          <w:lang w:val="es-PE"/>
+        </w:rPr>
+        <w:t>Vercel</w:t>
+      </w:r>
+      <w:proofErr w:type="spellEnd"/>
+      <w:r>
+        <w:rPr>
+          <w:lang w:val="es-PE"/>
+        </w:rPr>
+        <w:t xml:space="preserve">, Render, </w:t>
+      </w:r>
+      <w:proofErr w:type="spellStart"/>
+      <w:r>
+        <w:rPr>
+          <w:lang w:val="es-PE"/>
+        </w:rPr>
+        <w:t>Aiven</w:t>
+      </w:r>
+      <w:proofErr w:type="spellEnd"/>
+      <w:r>
+        <w:rPr>
+          <w:lang w:val="es-PE"/>
+        </w:rPr>
+        <w:t>).</w:t>
       </w:r>
     </w:p>
     <w:sectPr>
@@ -21240,14 +23034,7 @@
         <w:color w:val="808080"/>
         <w:sz w:val="16"/>
       </w:rPr>
-      <w:t>Guia Tecnica</w:t>
-    </w:r>
-    <w:r>
-      <w:rPr>
-        <w:color w:val="808080"/>
-        <w:sz w:val="16"/>
-      </w:rPr>
-      <w:t xml:space="preserve"> | Pag. </w:t>
+      <w:t xml:space="preserve">Guia Tecnica | Pag. </w:t>
     </w:r>
     <w:r>
       <w:fldChar w:fldCharType="begin"/>
@@ -21309,15 +23096,7 @@
         <w:color w:val="0066CC"/>
         <w:sz w:val="18"/>
       </w:rPr>
-      <w:t xml:space="preserve">Heladeria </w:t>
-    </w:r>
-    <w:r>
-      <w:rPr>
-        <w:b/>
-        <w:color w:val="0066CC"/>
-        <w:sz w:val="18"/>
-      </w:rPr>
-      <w:t>Conejito</w:t>
+      <w:t>Heladeria Conejito</w:t>
     </w:r>
   </w:p>
 </w:hdr>
@@ -21811,11 +23590,6 @@
     <w:lsdException w:name="Book Title" w:uiPriority="33" w:qFormat="1"/>
     <w:lsdException w:name="Bibliography" w:semiHidden="1" w:uiPriority="37" w:unhideWhenUsed="1"/>
     <w:lsdException w:name="TOC Heading" w:semiHidden="1" w:uiPriority="39" w:unhideWhenUsed="1" w:qFormat="1"/>
-    <w:lsdException w:name="Plain Table 5" w:semiHidden="1" w:unhideWhenUsed="1"/>
-    <w:lsdException w:name="Grid Table Light" w:semiHidden="1" w:unhideWhenUsed="1"/>
-    <w:lsdException w:name="Grid Table 1 Light" w:semiHidden="1" w:unhideWhenUsed="1"/>
-    <w:lsdException w:name="Grid Table 2" w:semiHidden="1" w:unhideWhenUsed="1"/>
-    <w:lsdException w:name="Grid Table 3" w:semiHidden="1" w:unhideWhenUsed="1"/>
     <w:lsdException w:name="Grid Table 4" w:uiPriority="49"/>
     <w:lsdException w:name="Grid Table 5 Dark" w:uiPriority="50"/>
     <w:lsdException w:name="Grid Table 6 Colorful" w:uiPriority="51"/>

</xml_diff>